<commit_message>
Technical Reference: add Appendix A, a worked cast end to end
Traces the top default-cast result digit by digit: Great Flood ->
Phoenix 2040 pair, Y = 1,562,508 days, the 19-grid snap to JD
2,466,285 (10 May 2040), the full V8 score table (12 points), and
why the result is novel rather than an echo. All figures read back
from a live cast.

Co-Authored-By: Claude Fable 5 <noreply@anthropic.com>
</commit_message>
<xml_diff>
--- a/docs/NATORI-ON-PSYFR-Technical-Reference.docx
+++ b/docs/NATORI-ON-PSYFR-Technical-Reference.docx
@@ -128,7 +128,7 @@
     <w:sdt>
       <w:sdtPr>
         <w:alias w:val="Table of Contents"/>
-        <w:id w:val="401034522"/>
+        <w:id w:val="2051185119"/>
       </w:sdtPr>
       <w:sdtEndPr/>
       <w:sdtContent>
@@ -156,7 +156,7 @@
           <w:r>
             <w:fldChar w:fldCharType="separate"/>
           </w:r>
-          <w:hyperlink w:anchor="_Toc232180680" w:history="1">
+          <w:hyperlink w:anchor="_Toc232180934" w:history="1">
             <w:r>
               <w:rPr>
                 <w:rStyle w:val="Hyperlink"/>
@@ -180,7 +180,7 @@
               <w:rPr>
                 <w:noProof/>
               </w:rPr>
-              <w:instrText xml:space="preserve"> PAGEREF _Toc232180680 \h </w:instrText>
+              <w:instrText xml:space="preserve"> PAGEREF _Toc232180934 \h </w:instrText>
             </w:r>
             <w:r>
               <w:rPr>
@@ -222,7 +222,7 @@
               <w14:ligatures w14:val="standardContextual"/>
             </w:rPr>
           </w:pPr>
-          <w:hyperlink w:anchor="_Toc232180681" w:history="1">
+          <w:hyperlink w:anchor="_Toc232180935" w:history="1">
             <w:r>
               <w:rPr>
                 <w:rStyle w:val="Hyperlink"/>
@@ -246,7 +246,7 @@
               <w:rPr>
                 <w:noProof/>
               </w:rPr>
-              <w:instrText xml:space="preserve"> PAGEREF _Toc232180681 \h </w:instrText>
+              <w:instrText xml:space="preserve"> PAGEREF _Toc232180935 \h </w:instrText>
             </w:r>
             <w:r>
               <w:rPr>
@@ -288,7 +288,7 @@
               <w14:ligatures w14:val="standardContextual"/>
             </w:rPr>
           </w:pPr>
-          <w:hyperlink w:anchor="_Toc232180682" w:history="1">
+          <w:hyperlink w:anchor="_Toc232180936" w:history="1">
             <w:r>
               <w:rPr>
                 <w:rStyle w:val="Hyperlink"/>
@@ -312,7 +312,7 @@
               <w:rPr>
                 <w:noProof/>
               </w:rPr>
-              <w:instrText xml:space="preserve"> PAGEREF _Toc232180682 \h </w:instrText>
+              <w:instrText xml:space="preserve"> PAGEREF _Toc232180936 \h </w:instrText>
             </w:r>
             <w:r>
               <w:rPr>
@@ -354,7 +354,7 @@
               <w14:ligatures w14:val="standardContextual"/>
             </w:rPr>
           </w:pPr>
-          <w:hyperlink w:anchor="_Toc232180683" w:history="1">
+          <w:hyperlink w:anchor="_Toc232180937" w:history="1">
             <w:r>
               <w:rPr>
                 <w:rStyle w:val="Hyperlink"/>
@@ -378,7 +378,7 @@
               <w:rPr>
                 <w:noProof/>
               </w:rPr>
-              <w:instrText xml:space="preserve"> PAGEREF _Toc232180683 \h </w:instrText>
+              <w:instrText xml:space="preserve"> PAGEREF _Toc232180937 \h </w:instrText>
             </w:r>
             <w:r>
               <w:rPr>
@@ -420,7 +420,7 @@
               <w14:ligatures w14:val="standardContextual"/>
             </w:rPr>
           </w:pPr>
-          <w:hyperlink w:anchor="_Toc232180684" w:history="1">
+          <w:hyperlink w:anchor="_Toc232180938" w:history="1">
             <w:r>
               <w:rPr>
                 <w:rStyle w:val="Hyperlink"/>
@@ -444,7 +444,7 @@
               <w:rPr>
                 <w:noProof/>
               </w:rPr>
-              <w:instrText xml:space="preserve"> PAGEREF _Toc232180684 \h </w:instrText>
+              <w:instrText xml:space="preserve"> PAGEREF _Toc232180938 \h </w:instrText>
             </w:r>
             <w:r>
               <w:rPr>
@@ -486,7 +486,7 @@
               <w14:ligatures w14:val="standardContextual"/>
             </w:rPr>
           </w:pPr>
-          <w:hyperlink w:anchor="_Toc232180685" w:history="1">
+          <w:hyperlink w:anchor="_Toc232180939" w:history="1">
             <w:r>
               <w:rPr>
                 <w:rStyle w:val="Hyperlink"/>
@@ -510,7 +510,7 @@
               <w:rPr>
                 <w:noProof/>
               </w:rPr>
-              <w:instrText xml:space="preserve"> PAGEREF _Toc232180685 \h </w:instrText>
+              <w:instrText xml:space="preserve"> PAGEREF _Toc232180939 \h </w:instrText>
             </w:r>
             <w:r>
               <w:rPr>
@@ -552,7 +552,7 @@
               <w14:ligatures w14:val="standardContextual"/>
             </w:rPr>
           </w:pPr>
-          <w:hyperlink w:anchor="_Toc232180686" w:history="1">
+          <w:hyperlink w:anchor="_Toc232180940" w:history="1">
             <w:r>
               <w:rPr>
                 <w:rStyle w:val="Hyperlink"/>
@@ -576,7 +576,7 @@
               <w:rPr>
                 <w:noProof/>
               </w:rPr>
-              <w:instrText xml:space="preserve"> PAGEREF _Toc232180686 \h </w:instrText>
+              <w:instrText xml:space="preserve"> PAGEREF _Toc232180940 \h </w:instrText>
             </w:r>
             <w:r>
               <w:rPr>
@@ -618,7 +618,7 @@
               <w14:ligatures w14:val="standardContextual"/>
             </w:rPr>
           </w:pPr>
-          <w:hyperlink w:anchor="_Toc232180687" w:history="1">
+          <w:hyperlink w:anchor="_Toc232180941" w:history="1">
             <w:r>
               <w:rPr>
                 <w:rStyle w:val="Hyperlink"/>
@@ -642,7 +642,7 @@
               <w:rPr>
                 <w:noProof/>
               </w:rPr>
-              <w:instrText xml:space="preserve"> PAGEREF _Toc232180687 \h </w:instrText>
+              <w:instrText xml:space="preserve"> PAGEREF _Toc232180941 \h </w:instrText>
             </w:r>
             <w:r>
               <w:rPr>
@@ -684,7 +684,7 @@
               <w14:ligatures w14:val="standardContextual"/>
             </w:rPr>
           </w:pPr>
-          <w:hyperlink w:anchor="_Toc232180688" w:history="1">
+          <w:hyperlink w:anchor="_Toc232180942" w:history="1">
             <w:r>
               <w:rPr>
                 <w:rStyle w:val="Hyperlink"/>
@@ -708,7 +708,7 @@
               <w:rPr>
                 <w:noProof/>
               </w:rPr>
-              <w:instrText xml:space="preserve"> PAGEREF _Toc232180688 \h </w:instrText>
+              <w:instrText xml:space="preserve"> PAGEREF _Toc232180942 \h </w:instrText>
             </w:r>
             <w:r>
               <w:rPr>
@@ -750,7 +750,7 @@
               <w14:ligatures w14:val="standardContextual"/>
             </w:rPr>
           </w:pPr>
-          <w:hyperlink w:anchor="_Toc232180689" w:history="1">
+          <w:hyperlink w:anchor="_Toc232180943" w:history="1">
             <w:r>
               <w:rPr>
                 <w:rStyle w:val="Hyperlink"/>
@@ -774,7 +774,7 @@
               <w:rPr>
                 <w:noProof/>
               </w:rPr>
-              <w:instrText xml:space="preserve"> PAGEREF _Toc232180689 \h </w:instrText>
+              <w:instrText xml:space="preserve"> PAGEREF _Toc232180943 \h </w:instrText>
             </w:r>
             <w:r>
               <w:rPr>
@@ -816,7 +816,7 @@
               <w14:ligatures w14:val="standardContextual"/>
             </w:rPr>
           </w:pPr>
-          <w:hyperlink w:anchor="_Toc232180690" w:history="1">
+          <w:hyperlink w:anchor="_Toc232180944" w:history="1">
             <w:r>
               <w:rPr>
                 <w:rStyle w:val="Hyperlink"/>
@@ -840,7 +840,7 @@
               <w:rPr>
                 <w:noProof/>
               </w:rPr>
-              <w:instrText xml:space="preserve"> PAGEREF _Toc232180690 \h </w:instrText>
+              <w:instrText xml:space="preserve"> PAGEREF _Toc232180944 \h </w:instrText>
             </w:r>
             <w:r>
               <w:rPr>
@@ -882,7 +882,7 @@
               <w14:ligatures w14:val="standardContextual"/>
             </w:rPr>
           </w:pPr>
-          <w:hyperlink w:anchor="_Toc232180691" w:history="1">
+          <w:hyperlink w:anchor="_Toc232180945" w:history="1">
             <w:r>
               <w:rPr>
                 <w:rStyle w:val="Hyperlink"/>
@@ -906,7 +906,7 @@
               <w:rPr>
                 <w:noProof/>
               </w:rPr>
-              <w:instrText xml:space="preserve"> PAGEREF _Toc232180691 \h </w:instrText>
+              <w:instrText xml:space="preserve"> PAGEREF _Toc232180945 \h </w:instrText>
             </w:r>
             <w:r>
               <w:rPr>
@@ -948,7 +948,7 @@
               <w14:ligatures w14:val="standardContextual"/>
             </w:rPr>
           </w:pPr>
-          <w:hyperlink w:anchor="_Toc232180692" w:history="1">
+          <w:hyperlink w:anchor="_Toc232180946" w:history="1">
             <w:r>
               <w:rPr>
                 <w:rStyle w:val="Hyperlink"/>
@@ -972,7 +972,7 @@
               <w:rPr>
                 <w:noProof/>
               </w:rPr>
-              <w:instrText xml:space="preserve"> PAGEREF _Toc232180692 \h </w:instrText>
+              <w:instrText xml:space="preserve"> PAGEREF _Toc232180946 \h </w:instrText>
             </w:r>
             <w:r>
               <w:rPr>
@@ -1014,7 +1014,7 @@
               <w14:ligatures w14:val="standardContextual"/>
             </w:rPr>
           </w:pPr>
-          <w:hyperlink w:anchor="_Toc232180693" w:history="1">
+          <w:hyperlink w:anchor="_Toc232180947" w:history="1">
             <w:r>
               <w:rPr>
                 <w:rStyle w:val="Hyperlink"/>
@@ -1038,7 +1038,7 @@
               <w:rPr>
                 <w:noProof/>
               </w:rPr>
-              <w:instrText xml:space="preserve"> PAGEREF _Toc232180693 \h </w:instrText>
+              <w:instrText xml:space="preserve"> PAGEREF _Toc232180947 \h </w:instrText>
             </w:r>
             <w:r>
               <w:rPr>
@@ -1080,7 +1080,7 @@
               <w14:ligatures w14:val="standardContextual"/>
             </w:rPr>
           </w:pPr>
-          <w:hyperlink w:anchor="_Toc232180694" w:history="1">
+          <w:hyperlink w:anchor="_Toc232180948" w:history="1">
             <w:r>
               <w:rPr>
                 <w:rStyle w:val="Hyperlink"/>
@@ -1104,7 +1104,7 @@
               <w:rPr>
                 <w:noProof/>
               </w:rPr>
-              <w:instrText xml:space="preserve"> PAGEREF _Toc232180694 \h </w:instrText>
+              <w:instrText xml:space="preserve"> PAGEREF _Toc232180948 \h </w:instrText>
             </w:r>
             <w:r>
               <w:rPr>
@@ -1146,7 +1146,7 @@
               <w14:ligatures w14:val="standardContextual"/>
             </w:rPr>
           </w:pPr>
-          <w:hyperlink w:anchor="_Toc232180695" w:history="1">
+          <w:hyperlink w:anchor="_Toc232180949" w:history="1">
             <w:r>
               <w:rPr>
                 <w:rStyle w:val="Hyperlink"/>
@@ -1170,7 +1170,7 @@
               <w:rPr>
                 <w:noProof/>
               </w:rPr>
-              <w:instrText xml:space="preserve"> PAGEREF _Toc232180695 \h </w:instrText>
+              <w:instrText xml:space="preserve"> PAGEREF _Toc232180949 \h </w:instrText>
             </w:r>
             <w:r>
               <w:rPr>
@@ -1212,7 +1212,7 @@
               <w14:ligatures w14:val="standardContextual"/>
             </w:rPr>
           </w:pPr>
-          <w:hyperlink w:anchor="_Toc232180696" w:history="1">
+          <w:hyperlink w:anchor="_Toc232180950" w:history="1">
             <w:r>
               <w:rPr>
                 <w:rStyle w:val="Hyperlink"/>
@@ -1236,7 +1236,7 @@
               <w:rPr>
                 <w:noProof/>
               </w:rPr>
-              <w:instrText xml:space="preserve"> PAGEREF _Toc232180696 \h </w:instrText>
+              <w:instrText xml:space="preserve"> PAGEREF _Toc232180950 \h </w:instrText>
             </w:r>
             <w:r>
               <w:rPr>
@@ -1278,7 +1278,7 @@
               <w14:ligatures w14:val="standardContextual"/>
             </w:rPr>
           </w:pPr>
-          <w:hyperlink w:anchor="_Toc232180697" w:history="1">
+          <w:hyperlink w:anchor="_Toc232180951" w:history="1">
             <w:r>
               <w:rPr>
                 <w:rStyle w:val="Hyperlink"/>
@@ -1302,7 +1302,7 @@
               <w:rPr>
                 <w:noProof/>
               </w:rPr>
-              <w:instrText xml:space="preserve"> PAGEREF _Toc232180697 \h </w:instrText>
+              <w:instrText xml:space="preserve"> PAGEREF _Toc232180951 \h </w:instrText>
             </w:r>
             <w:r>
               <w:rPr>
@@ -1344,7 +1344,7 @@
               <w14:ligatures w14:val="standardContextual"/>
             </w:rPr>
           </w:pPr>
-          <w:hyperlink w:anchor="_Toc232180698" w:history="1">
+          <w:hyperlink w:anchor="_Toc232180952" w:history="1">
             <w:r>
               <w:rPr>
                 <w:rStyle w:val="Hyperlink"/>
@@ -1368,7 +1368,7 @@
               <w:rPr>
                 <w:noProof/>
               </w:rPr>
-              <w:instrText xml:space="preserve"> PAGEREF _Toc232180698 \h </w:instrText>
+              <w:instrText xml:space="preserve"> PAGEREF _Toc232180952 \h </w:instrText>
             </w:r>
             <w:r>
               <w:rPr>
@@ -1410,7 +1410,7 @@
               <w14:ligatures w14:val="standardContextual"/>
             </w:rPr>
           </w:pPr>
-          <w:hyperlink w:anchor="_Toc232180699" w:history="1">
+          <w:hyperlink w:anchor="_Toc232180953" w:history="1">
             <w:r>
               <w:rPr>
                 <w:rStyle w:val="Hyperlink"/>
@@ -1434,7 +1434,7 @@
               <w:rPr>
                 <w:noProof/>
               </w:rPr>
-              <w:instrText xml:space="preserve"> PAGEREF _Toc232180699 \h </w:instrText>
+              <w:instrText xml:space="preserve"> PAGEREF _Toc232180953 \h </w:instrText>
             </w:r>
             <w:r>
               <w:rPr>
@@ -1476,7 +1476,7 @@
               <w14:ligatures w14:val="standardContextual"/>
             </w:rPr>
           </w:pPr>
-          <w:hyperlink w:anchor="_Toc232180700" w:history="1">
+          <w:hyperlink w:anchor="_Toc232180954" w:history="1">
             <w:r>
               <w:rPr>
                 <w:rStyle w:val="Hyperlink"/>
@@ -1500,7 +1500,7 @@
               <w:rPr>
                 <w:noProof/>
               </w:rPr>
-              <w:instrText xml:space="preserve"> PAGEREF _Toc232180700 \h </w:instrText>
+              <w:instrText xml:space="preserve"> PAGEREF _Toc232180954 \h </w:instrText>
             </w:r>
             <w:r>
               <w:rPr>
@@ -1518,6 +1518,336 @@
                 <w:noProof/>
               </w:rPr>
               <w:t>9</w:t>
+            </w:r>
+            <w:r>
+              <w:rPr>
+                <w:noProof/>
+              </w:rPr>
+              <w:fldChar w:fldCharType="end"/>
+            </w:r>
+          </w:hyperlink>
+        </w:p>
+        <w:p>
+          <w:pPr>
+            <w:pStyle w:val="TOC1"/>
+            <w:tabs>
+              <w:tab w:val="right" w:leader="dot" w:pos="9350"/>
+            </w:tabs>
+            <w:rPr>
+              <w:rFonts w:asciiTheme="minorHAnsi" w:eastAsiaTheme="minorEastAsia" w:hAnsiTheme="minorHAnsi" w:cstheme="minorBidi"/>
+              <w:noProof/>
+              <w:kern w:val="2"/>
+              <w:sz w:val="24"/>
+              <w:szCs w:val="24"/>
+              <w14:ligatures w14:val="standardContextual"/>
+            </w:rPr>
+          </w:pPr>
+          <w:hyperlink w:anchor="_Toc232180955" w:history="1">
+            <w:r>
+              <w:rPr>
+                <w:rStyle w:val="Hyperlink"/>
+                <w:noProof/>
+              </w:rPr>
+              <w:t>Appendix A — A Worked Cast, End to End</w:t>
+            </w:r>
+            <w:r>
+              <w:rPr>
+                <w:noProof/>
+              </w:rPr>
+              <w:tab/>
+            </w:r>
+            <w:r>
+              <w:rPr>
+                <w:noProof/>
+              </w:rPr>
+              <w:fldChar w:fldCharType="begin"/>
+            </w:r>
+            <w:r>
+              <w:rPr>
+                <w:noProof/>
+              </w:rPr>
+              <w:instrText xml:space="preserve"> PAGEREF _Toc232180955 \h </w:instrText>
+            </w:r>
+            <w:r>
+              <w:rPr>
+                <w:noProof/>
+              </w:rPr>
+            </w:r>
+            <w:r>
+              <w:rPr>
+                <w:noProof/>
+              </w:rPr>
+              <w:fldChar w:fldCharType="separate"/>
+            </w:r>
+            <w:r>
+              <w:rPr>
+                <w:noProof/>
+              </w:rPr>
+              <w:t>9</w:t>
+            </w:r>
+            <w:r>
+              <w:rPr>
+                <w:noProof/>
+              </w:rPr>
+              <w:fldChar w:fldCharType="end"/>
+            </w:r>
+          </w:hyperlink>
+        </w:p>
+        <w:p>
+          <w:pPr>
+            <w:pStyle w:val="TOC2"/>
+            <w:tabs>
+              <w:tab w:val="right" w:leader="dot" w:pos="9350"/>
+            </w:tabs>
+            <w:rPr>
+              <w:rFonts w:asciiTheme="minorHAnsi" w:eastAsiaTheme="minorEastAsia" w:hAnsiTheme="minorHAnsi" w:cstheme="minorBidi"/>
+              <w:noProof/>
+              <w:kern w:val="2"/>
+              <w:sz w:val="24"/>
+              <w:szCs w:val="24"/>
+              <w14:ligatures w14:val="standardContextual"/>
+            </w:rPr>
+          </w:pPr>
+          <w:hyperlink w:anchor="_Toc232180956" w:history="1">
+            <w:r>
+              <w:rPr>
+                <w:rStyle w:val="Hyperlink"/>
+                <w:noProof/>
+              </w:rPr>
+              <w:t>A.1 The anchor pair</w:t>
+            </w:r>
+            <w:r>
+              <w:rPr>
+                <w:noProof/>
+              </w:rPr>
+              <w:tab/>
+            </w:r>
+            <w:r>
+              <w:rPr>
+                <w:noProof/>
+              </w:rPr>
+              <w:fldChar w:fldCharType="begin"/>
+            </w:r>
+            <w:r>
+              <w:rPr>
+                <w:noProof/>
+              </w:rPr>
+              <w:instrText xml:space="preserve"> PAGEREF _Toc232180956 \h </w:instrText>
+            </w:r>
+            <w:r>
+              <w:rPr>
+                <w:noProof/>
+              </w:rPr>
+            </w:r>
+            <w:r>
+              <w:rPr>
+                <w:noProof/>
+              </w:rPr>
+              <w:fldChar w:fldCharType="separate"/>
+            </w:r>
+            <w:r>
+              <w:rPr>
+                <w:noProof/>
+              </w:rPr>
+              <w:t>9</w:t>
+            </w:r>
+            <w:r>
+              <w:rPr>
+                <w:noProof/>
+              </w:rPr>
+              <w:fldChar w:fldCharType="end"/>
+            </w:r>
+          </w:hyperlink>
+        </w:p>
+        <w:p>
+          <w:pPr>
+            <w:pStyle w:val="TOC2"/>
+            <w:tabs>
+              <w:tab w:val="right" w:leader="dot" w:pos="9350"/>
+            </w:tabs>
+            <w:rPr>
+              <w:rFonts w:asciiTheme="minorHAnsi" w:eastAsiaTheme="minorEastAsia" w:hAnsiTheme="minorHAnsi" w:cstheme="minorBidi"/>
+              <w:noProof/>
+              <w:kern w:val="2"/>
+              <w:sz w:val="24"/>
+              <w:szCs w:val="24"/>
+              <w14:ligatures w14:val="standardContextual"/>
+            </w:rPr>
+          </w:pPr>
+          <w:hyperlink w:anchor="_Toc232180957" w:history="1">
+            <w:r>
+              <w:rPr>
+                <w:rStyle w:val="Hyperlink"/>
+                <w:noProof/>
+              </w:rPr>
+              <w:t>A.2 The operation</w:t>
+            </w:r>
+            <w:r>
+              <w:rPr>
+                <w:noProof/>
+              </w:rPr>
+              <w:tab/>
+            </w:r>
+            <w:r>
+              <w:rPr>
+                <w:noProof/>
+              </w:rPr>
+              <w:fldChar w:fldCharType="begin"/>
+            </w:r>
+            <w:r>
+              <w:rPr>
+                <w:noProof/>
+              </w:rPr>
+              <w:instrText xml:space="preserve"> PAGEREF _Toc232180957 \h </w:instrText>
+            </w:r>
+            <w:r>
+              <w:rPr>
+                <w:noProof/>
+              </w:rPr>
+            </w:r>
+            <w:r>
+              <w:rPr>
+                <w:noProof/>
+              </w:rPr>
+              <w:fldChar w:fldCharType="separate"/>
+            </w:r>
+            <w:r>
+              <w:rPr>
+                <w:noProof/>
+              </w:rPr>
+              <w:t>9</w:t>
+            </w:r>
+            <w:r>
+              <w:rPr>
+                <w:noProof/>
+              </w:rPr>
+              <w:fldChar w:fldCharType="end"/>
+            </w:r>
+          </w:hyperlink>
+        </w:p>
+        <w:p>
+          <w:pPr>
+            <w:pStyle w:val="TOC2"/>
+            <w:tabs>
+              <w:tab w:val="right" w:leader="dot" w:pos="9350"/>
+            </w:tabs>
+            <w:rPr>
+              <w:rFonts w:asciiTheme="minorHAnsi" w:eastAsiaTheme="minorEastAsia" w:hAnsiTheme="minorHAnsi" w:cstheme="minorBidi"/>
+              <w:noProof/>
+              <w:kern w:val="2"/>
+              <w:sz w:val="24"/>
+              <w:szCs w:val="24"/>
+              <w14:ligatures w14:val="standardContextual"/>
+            </w:rPr>
+          </w:pPr>
+          <w:hyperlink w:anchor="_Toc232180958" w:history="1">
+            <w:r>
+              <w:rPr>
+                <w:rStyle w:val="Hyperlink"/>
+                <w:noProof/>
+              </w:rPr>
+              <w:t>A.3 Scoring under V8</w:t>
+            </w:r>
+            <w:r>
+              <w:rPr>
+                <w:noProof/>
+              </w:rPr>
+              <w:tab/>
+            </w:r>
+            <w:r>
+              <w:rPr>
+                <w:noProof/>
+              </w:rPr>
+              <w:fldChar w:fldCharType="begin"/>
+            </w:r>
+            <w:r>
+              <w:rPr>
+                <w:noProof/>
+              </w:rPr>
+              <w:instrText xml:space="preserve"> PAGEREF _Toc232180958 \h </w:instrText>
+            </w:r>
+            <w:r>
+              <w:rPr>
+                <w:noProof/>
+              </w:rPr>
+            </w:r>
+            <w:r>
+              <w:rPr>
+                <w:noProof/>
+              </w:rPr>
+              <w:fldChar w:fldCharType="separate"/>
+            </w:r>
+            <w:r>
+              <w:rPr>
+                <w:noProof/>
+              </w:rPr>
+              <w:t>9</w:t>
+            </w:r>
+            <w:r>
+              <w:rPr>
+                <w:noProof/>
+              </w:rPr>
+              <w:fldChar w:fldCharType="end"/>
+            </w:r>
+          </w:hyperlink>
+        </w:p>
+        <w:p>
+          <w:pPr>
+            <w:pStyle w:val="TOC2"/>
+            <w:tabs>
+              <w:tab w:val="right" w:leader="dot" w:pos="9350"/>
+            </w:tabs>
+            <w:rPr>
+              <w:rFonts w:asciiTheme="minorHAnsi" w:eastAsiaTheme="minorEastAsia" w:hAnsiTheme="minorHAnsi" w:cstheme="minorBidi"/>
+              <w:noProof/>
+              <w:kern w:val="2"/>
+              <w:sz w:val="24"/>
+              <w:szCs w:val="24"/>
+              <w14:ligatures w14:val="standardContextual"/>
+            </w:rPr>
+          </w:pPr>
+          <w:hyperlink w:anchor="_Toc232180959" w:history="1">
+            <w:r>
+              <w:rPr>
+                <w:rStyle w:val="Hyperlink"/>
+                <w:noProof/>
+              </w:rPr>
+              <w:t>A.4 Why it is novel, not an echo</w:t>
+            </w:r>
+            <w:r>
+              <w:rPr>
+                <w:noProof/>
+              </w:rPr>
+              <w:tab/>
+            </w:r>
+            <w:r>
+              <w:rPr>
+                <w:noProof/>
+              </w:rPr>
+              <w:fldChar w:fldCharType="begin"/>
+            </w:r>
+            <w:r>
+              <w:rPr>
+                <w:noProof/>
+              </w:rPr>
+              <w:instrText xml:space="preserve"> PAGEREF _Toc232180959 \h </w:instrText>
+            </w:r>
+            <w:r>
+              <w:rPr>
+                <w:noProof/>
+              </w:rPr>
+            </w:r>
+            <w:r>
+              <w:rPr>
+                <w:noProof/>
+              </w:rPr>
+              <w:fldChar w:fldCharType="separate"/>
+            </w:r>
+            <w:r>
+              <w:rPr>
+                <w:noProof/>
+              </w:rPr>
+              <w:t>10</w:t>
             </w:r>
             <w:r>
               <w:rPr>
@@ -1543,7 +1873,7 @@
       <w:pPr>
         <w:pStyle w:val="Heading1"/>
       </w:pPr>
-      <w:bookmarkStart w:id="0" w:name="_Toc232180680"/>
+      <w:bookmarkStart w:id="0" w:name="_Toc232180934"/>
       <w:r>
         <w:t>1. Purpose &amp; Lineage</w:t>
       </w:r>
@@ -1639,7 +1969,7 @@
       <w:pPr>
         <w:pStyle w:val="Heading2"/>
       </w:pPr>
-      <w:bookmarkStart w:id="1" w:name="_Toc232180681"/>
+      <w:bookmarkStart w:id="1" w:name="_Toc232180935"/>
       <w:r>
         <w:t>1.1 Deliverables</w:t>
       </w:r>
@@ -2106,7 +2436,7 @@
       <w:pPr>
         <w:pStyle w:val="Heading2"/>
       </w:pPr>
-      <w:bookmarkStart w:id="2" w:name="_Toc232180682"/>
+      <w:bookmarkStart w:id="2" w:name="_Toc232180936"/>
       <w:r>
         <w:t>1.2 The contract between the two pages</w:t>
       </w:r>
@@ -2167,7 +2497,7 @@
       <w:pPr>
         <w:pStyle w:val="Heading1"/>
       </w:pPr>
-      <w:bookmarkStart w:id="3" w:name="_Toc232180683"/>
+      <w:bookmarkStart w:id="3" w:name="_Toc232180937"/>
       <w:r>
         <w:t>2. Architecture</w:t>
       </w:r>
@@ -2303,7 +2633,7 @@
       <w:pPr>
         <w:pStyle w:val="Heading1"/>
       </w:pPr>
-      <w:bookmarkStart w:id="4" w:name="_Toc232180684"/>
+      <w:bookmarkStart w:id="4" w:name="_Toc232180938"/>
       <w:r>
         <w:t>3. The Calendar Core</w:t>
       </w:r>
@@ -3208,7 +3538,7 @@
       <w:pPr>
         <w:pStyle w:val="Heading2"/>
       </w:pPr>
-      <w:bookmarkStart w:id="5" w:name="_Toc232180685"/>
+      <w:bookmarkStart w:id="5" w:name="_Toc232180939"/>
       <w:r>
         <w:t>3.1 Sanity anchors</w:t>
       </w:r>
@@ -3557,7 +3887,7 @@
       <w:pPr>
         <w:pStyle w:val="Heading1"/>
       </w:pPr>
-      <w:bookmarkStart w:id="6" w:name="_Toc232180686"/>
+      <w:bookmarkStart w:id="6" w:name="_Toc232180940"/>
       <w:r>
         <w:t>4. The Operation Grammar</w:t>
       </w:r>
@@ -4278,7 +4608,7 @@
       <w:pPr>
         <w:pStyle w:val="Heading1"/>
       </w:pPr>
-      <w:bookmarkStart w:id="7" w:name="_Toc232180687"/>
+      <w:bookmarkStart w:id="7" w:name="_Toc232180941"/>
       <w:r>
         <w:t>5. The Cast Pipeline</w:t>
       </w:r>
@@ -4440,7 +4770,7 @@
       <w:pPr>
         <w:pStyle w:val="Heading1"/>
       </w:pPr>
-      <w:bookmarkStart w:id="8" w:name="_Toc232180688"/>
+      <w:bookmarkStart w:id="8" w:name="_Toc232180942"/>
       <w:r>
         <w:t>6. Scoring — the Two Lenses</w:t>
       </w:r>
@@ -5916,9 +6246,17 @@
     </w:p>
     <w:p>
       <w:pPr>
+        <w:spacing w:after="120"/>
+      </w:pPr>
+      <w:r>
+        <w:t>Appendix A traces one real projection — the top result of the default cast — through every stage of this pipeline, digit by digit.</w:t>
+      </w:r>
+    </w:p>
+    <w:p>
+      <w:pPr>
         <w:pStyle w:val="Heading1"/>
       </w:pPr>
-      <w:bookmarkStart w:id="9" w:name="_Toc232180689"/>
+      <w:bookmarkStart w:id="9" w:name="_Toc232180943"/>
       <w:r>
         <w:t>7. Convergence Detection</w:t>
       </w:r>
@@ -6021,7 +6359,7 @@
       <w:pPr>
         <w:pStyle w:val="Heading1"/>
       </w:pPr>
-      <w:bookmarkStart w:id="10" w:name="_Toc232180690"/>
+      <w:bookmarkStart w:id="10" w:name="_Toc232180944"/>
       <w:r>
         <w:t>8. The Eclipse Tables</w:t>
       </w:r>
@@ -6060,7 +6398,7 @@
       <w:pPr>
         <w:pStyle w:val="Heading1"/>
       </w:pPr>
-      <w:bookmarkStart w:id="11" w:name="_Toc232180691"/>
+      <w:bookmarkStart w:id="11" w:name="_Toc232180945"/>
       <w:r>
         <w:t>9. The Ledger &amp; The Wheels</w:t>
       </w:r>
@@ -6107,7 +6445,7 @@
       <w:pPr>
         <w:pStyle w:val="Heading1"/>
       </w:pPr>
-      <w:bookmarkStart w:id="12" w:name="_Toc232180692"/>
+      <w:bookmarkStart w:id="12" w:name="_Toc232180946"/>
       <w:r>
         <w:t>10. The Default Pack &amp; Themed Packs</w:t>
       </w:r>
@@ -7423,7 +7761,7 @@
       <w:pPr>
         <w:pStyle w:val="Heading2"/>
       </w:pPr>
-      <w:bookmarkStart w:id="13" w:name="_Toc232180693"/>
+      <w:bookmarkStart w:id="13" w:name="_Toc232180947"/>
       <w:r>
         <w:t>10.1 Configuration files</w:t>
       </w:r>
@@ -7461,7 +7799,7 @@
       <w:pPr>
         <w:pStyle w:val="Heading1"/>
       </w:pPr>
-      <w:bookmarkStart w:id="14" w:name="_Toc232180694"/>
+      <w:bookmarkStart w:id="14" w:name="_Toc232180948"/>
       <w:r>
         <w:t>11. The UI Layer</w:t>
       </w:r>
@@ -7523,7 +7861,7 @@
       <w:pPr>
         <w:pStyle w:val="Heading2"/>
       </w:pPr>
-      <w:bookmarkStart w:id="15" w:name="_Toc232180695"/>
+      <w:bookmarkStart w:id="15" w:name="_Toc232180949"/>
       <w:r>
         <w:t>11.1 Progressive disclosure (v1.0)</w:t>
       </w:r>
@@ -7541,7 +7879,7 @@
       <w:pPr>
         <w:pStyle w:val="Heading2"/>
       </w:pPr>
-      <w:bookmarkStart w:id="16" w:name="_Toc232180696"/>
+      <w:bookmarkStart w:id="16" w:name="_Toc232180950"/>
       <w:r>
         <w:t>11.2 Simple view</w:t>
       </w:r>
@@ -7581,7 +7919,7 @@
       <w:pPr>
         <w:pStyle w:val="Heading1"/>
       </w:pPr>
-      <w:bookmarkStart w:id="17" w:name="_Toc232180697"/>
+      <w:bookmarkStart w:id="17" w:name="_Toc232180951"/>
       <w:r>
         <w:t>12. Verification — the Discipline</w:t>
       </w:r>
@@ -7820,7 +8158,7 @@
       <w:pPr>
         <w:pStyle w:val="Heading1"/>
       </w:pPr>
-      <w:bookmarkStart w:id="18" w:name="_Toc232180698"/>
+      <w:bookmarkStart w:id="18" w:name="_Toc232180952"/>
       <w:r>
         <w:t>13. Release &amp; Distribution (v1.0)</w:t>
       </w:r>
@@ -7918,7 +8256,7 @@
       <w:pPr>
         <w:pStyle w:val="Heading2"/>
       </w:pPr>
-      <w:bookmarkStart w:id="19" w:name="_Toc232180699"/>
+      <w:bookmarkStart w:id="19" w:name="_Toc232180953"/>
       <w:r>
         <w:t>13.1 Renaming rule</w:t>
       </w:r>
@@ -7968,7 +8306,7 @@
       <w:pPr>
         <w:pStyle w:val="Heading1"/>
       </w:pPr>
-      <w:bookmarkStart w:id="20" w:name="_Toc232180700"/>
+      <w:bookmarkStart w:id="20" w:name="_Toc232180954"/>
       <w:r>
         <w:t>14. Known Limits &amp; Next Steps</w:t>
       </w:r>
@@ -8037,6 +8375,1724 @@
       </w:pPr>
       <w:r>
         <w:t>Candidates: a printable cheat-sheet, engine screenshots embedded in the walkthrough, more themed packs.</w:t>
+      </w:r>
+    </w:p>
+    <w:p>
+      <w:pPr>
+        <w:pStyle w:val="Heading1"/>
+      </w:pPr>
+      <w:bookmarkStart w:id="21" w:name="_Toc232180955"/>
+      <w:r>
+        <w:t>Appendix A — A Worked Cast, End to End</w:t>
+      </w:r>
+      <w:bookmarkEnd w:id="21"/>
+    </w:p>
+    <w:p>
+      <w:pPr>
+        <w:spacing w:after="120"/>
+      </w:pPr>
+      <w:r>
+        <w:t xml:space="preserve">This is the </w:t>
+      </w:r>
+      <w:r>
+        <w:rPr>
+          <w:b/>
+          <w:bCs/>
+        </w:rPr>
+        <w:t>top-scoring result of the default cast</w:t>
+      </w:r>
+      <w:r>
+        <w:t>, reproduced exactly as the engine computes it. Every number below was read back from a live cast, not calculated by hand. Setup: the three default anchors, the Default 19 pack, the V8 lens.</w:t>
+      </w:r>
+    </w:p>
+    <w:p>
+      <w:pPr>
+        <w:pStyle w:val="Heading2"/>
+      </w:pPr>
+      <w:bookmarkStart w:id="22" w:name="_Toc232180956"/>
+      <w:r>
+        <w:t>A.1 The anchor pair</w:t>
+      </w:r>
+      <w:bookmarkEnd w:id="22"/>
+    </w:p>
+    <w:tbl>
+      <w:tblPr>
+        <w:tblW w:w="9360" w:type="dxa"/>
+        <w:tblBorders>
+          <w:top w:val="single" w:sz="4" w:space="0" w:color="auto"/>
+          <w:left w:val="single" w:sz="4" w:space="0" w:color="auto"/>
+          <w:bottom w:val="single" w:sz="4" w:space="0" w:color="auto"/>
+          <w:right w:val="single" w:sz="4" w:space="0" w:color="auto"/>
+          <w:insideH w:val="single" w:sz="4" w:space="0" w:color="auto"/>
+          <w:insideV w:val="single" w:sz="4" w:space="0" w:color="auto"/>
+        </w:tblBorders>
+        <w:tblCellMar>
+          <w:left w:w="10" w:type="dxa"/>
+          <w:right w:w="10" w:type="dxa"/>
+        </w:tblCellMar>
+        <w:tblLook w:val="04A0" w:firstRow="1" w:lastRow="0" w:firstColumn="1" w:lastColumn="0" w:noHBand="0" w:noVBand="1"/>
+      </w:tblPr>
+      <w:tblGrid>
+        <w:gridCol w:w="3120"/>
+        <w:gridCol w:w="2340"/>
+        <w:gridCol w:w="2000"/>
+        <w:gridCol w:w="1900"/>
+      </w:tblGrid>
+      <w:tr>
+        <w:tblPrEx>
+          <w:tblCellMar>
+            <w:top w:w="0" w:type="dxa"/>
+            <w:bottom w:w="0" w:type="dxa"/>
+          </w:tblCellMar>
+        </w:tblPrEx>
+        <w:trPr>
+          <w:tblHeader/>
+        </w:trPr>
+        <w:tc>
+          <w:tcPr>
+            <w:tcW w:w="3120" w:type="dxa"/>
+            <w:tcBorders>
+              <w:top w:val="single" w:sz="1" w:space="0" w:color="BBAE8C"/>
+              <w:left w:val="single" w:sz="1" w:space="0" w:color="BBAE8C"/>
+              <w:bottom w:val="single" w:sz="1" w:space="0" w:color="BBAE8C"/>
+              <w:right w:val="single" w:sz="1" w:space="0" w:color="BBAE8C"/>
+            </w:tcBorders>
+            <w:shd w:val="clear" w:color="auto" w:fill="E8DFC8"/>
+            <w:tcMar>
+              <w:top w:w="60" w:type="dxa"/>
+              <w:left w:w="110" w:type="dxa"/>
+              <w:bottom w:w="60" w:type="dxa"/>
+              <w:right w:w="110" w:type="dxa"/>
+            </w:tcMar>
+          </w:tcPr>
+          <w:p>
+            <w:r>
+              <w:rPr>
+                <w:b/>
+                <w:bCs/>
+                <w:sz w:val="19"/>
+                <w:szCs w:val="19"/>
+              </w:rPr>
+              <w:t>Anchor</w:t>
+            </w:r>
+          </w:p>
+        </w:tc>
+        <w:tc>
+          <w:tcPr>
+            <w:tcW w:w="2340" w:type="dxa"/>
+            <w:tcBorders>
+              <w:top w:val="single" w:sz="1" w:space="0" w:color="BBAE8C"/>
+              <w:left w:val="single" w:sz="1" w:space="0" w:color="BBAE8C"/>
+              <w:bottom w:val="single" w:sz="1" w:space="0" w:color="BBAE8C"/>
+              <w:right w:val="single" w:sz="1" w:space="0" w:color="BBAE8C"/>
+            </w:tcBorders>
+            <w:shd w:val="clear" w:color="auto" w:fill="E8DFC8"/>
+            <w:tcMar>
+              <w:top w:w="60" w:type="dxa"/>
+              <w:left w:w="110" w:type="dxa"/>
+              <w:bottom w:w="60" w:type="dxa"/>
+              <w:right w:w="110" w:type="dxa"/>
+            </w:tcMar>
+          </w:tcPr>
+          <w:p>
+            <w:r>
+              <w:rPr>
+                <w:b/>
+                <w:bCs/>
+                <w:sz w:val="19"/>
+                <w:szCs w:val="19"/>
+              </w:rPr>
+              <w:t>Date</w:t>
+            </w:r>
+          </w:p>
+        </w:tc>
+        <w:tc>
+          <w:tcPr>
+            <w:tcW w:w="2000" w:type="dxa"/>
+            <w:tcBorders>
+              <w:top w:val="single" w:sz="1" w:space="0" w:color="BBAE8C"/>
+              <w:left w:val="single" w:sz="1" w:space="0" w:color="BBAE8C"/>
+              <w:bottom w:val="single" w:sz="1" w:space="0" w:color="BBAE8C"/>
+              <w:right w:val="single" w:sz="1" w:space="0" w:color="BBAE8C"/>
+            </w:tcBorders>
+            <w:shd w:val="clear" w:color="auto" w:fill="E8DFC8"/>
+            <w:tcMar>
+              <w:top w:w="60" w:type="dxa"/>
+              <w:left w:w="110" w:type="dxa"/>
+              <w:bottom w:w="60" w:type="dxa"/>
+              <w:right w:w="110" w:type="dxa"/>
+            </w:tcMar>
+          </w:tcPr>
+          <w:p>
+            <w:r>
+              <w:rPr>
+                <w:b/>
+                <w:bCs/>
+                <w:sz w:val="19"/>
+                <w:szCs w:val="19"/>
+              </w:rPr>
+              <w:t>JD</w:t>
+            </w:r>
+          </w:p>
+        </w:tc>
+        <w:tc>
+          <w:tcPr>
+            <w:tcW w:w="1900" w:type="dxa"/>
+            <w:tcBorders>
+              <w:top w:val="single" w:sz="1" w:space="0" w:color="BBAE8C"/>
+              <w:left w:val="single" w:sz="1" w:space="0" w:color="BBAE8C"/>
+              <w:bottom w:val="single" w:sz="1" w:space="0" w:color="BBAE8C"/>
+              <w:right w:val="single" w:sz="1" w:space="0" w:color="BBAE8C"/>
+            </w:tcBorders>
+            <w:shd w:val="clear" w:color="auto" w:fill="E8DFC8"/>
+            <w:tcMar>
+              <w:top w:w="60" w:type="dxa"/>
+              <w:left w:w="110" w:type="dxa"/>
+              <w:bottom w:w="60" w:type="dxa"/>
+              <w:right w:w="110" w:type="dxa"/>
+            </w:tcMar>
+          </w:tcPr>
+          <w:p>
+            <w:r>
+              <w:rPr>
+                <w:b/>
+                <w:bCs/>
+                <w:sz w:val="19"/>
+                <w:szCs w:val="19"/>
+              </w:rPr>
+              <w:t>Role</w:t>
+            </w:r>
+          </w:p>
+        </w:tc>
+      </w:tr>
+      <w:tr>
+        <w:tblPrEx>
+          <w:tblCellMar>
+            <w:top w:w="0" w:type="dxa"/>
+            <w:bottom w:w="0" w:type="dxa"/>
+          </w:tblCellMar>
+        </w:tblPrEx>
+        <w:tc>
+          <w:tcPr>
+            <w:tcW w:w="3120" w:type="dxa"/>
+            <w:tcBorders>
+              <w:top w:val="single" w:sz="1" w:space="0" w:color="BBAE8C"/>
+              <w:left w:val="single" w:sz="1" w:space="0" w:color="BBAE8C"/>
+              <w:bottom w:val="single" w:sz="1" w:space="0" w:color="BBAE8C"/>
+              <w:right w:val="single" w:sz="1" w:space="0" w:color="BBAE8C"/>
+            </w:tcBorders>
+            <w:tcMar>
+              <w:top w:w="60" w:type="dxa"/>
+              <w:left w:w="110" w:type="dxa"/>
+              <w:bottom w:w="60" w:type="dxa"/>
+              <w:right w:w="110" w:type="dxa"/>
+            </w:tcMar>
+          </w:tcPr>
+          <w:p>
+            <w:r>
+              <w:rPr>
+                <w:sz w:val="20"/>
+                <w:szCs w:val="20"/>
+              </w:rPr>
+              <w:t>Great Flood</w:t>
+            </w:r>
+          </w:p>
+        </w:tc>
+        <w:tc>
+          <w:tcPr>
+            <w:tcW w:w="2340" w:type="dxa"/>
+            <w:tcBorders>
+              <w:top w:val="single" w:sz="1" w:space="0" w:color="BBAE8C"/>
+              <w:left w:val="single" w:sz="1" w:space="0" w:color="BBAE8C"/>
+              <w:bottom w:val="single" w:sz="1" w:space="0" w:color="BBAE8C"/>
+              <w:right w:val="single" w:sz="1" w:space="0" w:color="BBAE8C"/>
+            </w:tcBorders>
+            <w:tcMar>
+              <w:top w:w="60" w:type="dxa"/>
+              <w:left w:w="110" w:type="dxa"/>
+              <w:bottom w:w="60" w:type="dxa"/>
+              <w:right w:w="110" w:type="dxa"/>
+            </w:tcMar>
+          </w:tcPr>
+          <w:p>
+            <w:r>
+              <w:rPr>
+                <w:sz w:val="20"/>
+                <w:szCs w:val="20"/>
+              </w:rPr>
+              <w:t>15 May 2239 BC</w:t>
+            </w:r>
+          </w:p>
+        </w:tc>
+        <w:tc>
+          <w:tcPr>
+            <w:tcW w:w="2000" w:type="dxa"/>
+            <w:tcBorders>
+              <w:top w:val="single" w:sz="1" w:space="0" w:color="BBAE8C"/>
+              <w:left w:val="single" w:sz="1" w:space="0" w:color="BBAE8C"/>
+              <w:bottom w:val="single" w:sz="1" w:space="0" w:color="BBAE8C"/>
+              <w:right w:val="single" w:sz="1" w:space="0" w:color="BBAE8C"/>
+            </w:tcBorders>
+            <w:tcMar>
+              <w:top w:w="60" w:type="dxa"/>
+              <w:left w:w="110" w:type="dxa"/>
+              <w:bottom w:w="60" w:type="dxa"/>
+              <w:right w:w="110" w:type="dxa"/>
+            </w:tcMar>
+          </w:tcPr>
+          <w:p>
+            <w:r>
+              <w:rPr>
+                <w:rFonts w:ascii="Consolas" w:eastAsia="Consolas" w:hAnsi="Consolas" w:cs="Consolas"/>
+                <w:sz w:val="18"/>
+                <w:szCs w:val="18"/>
+              </w:rPr>
+              <w:t>903,782</w:t>
+            </w:r>
+          </w:p>
+        </w:tc>
+        <w:tc>
+          <w:tcPr>
+            <w:tcW w:w="1900" w:type="dxa"/>
+            <w:tcBorders>
+              <w:top w:val="single" w:sz="1" w:space="0" w:color="BBAE8C"/>
+              <w:left w:val="single" w:sz="1" w:space="0" w:color="BBAE8C"/>
+              <w:bottom w:val="single" w:sz="1" w:space="0" w:color="BBAE8C"/>
+              <w:right w:val="single" w:sz="1" w:space="0" w:color="BBAE8C"/>
+            </w:tcBorders>
+            <w:tcMar>
+              <w:top w:w="60" w:type="dxa"/>
+              <w:left w:w="110" w:type="dxa"/>
+              <w:bottom w:w="60" w:type="dxa"/>
+              <w:right w:w="110" w:type="dxa"/>
+            </w:tcMar>
+          </w:tcPr>
+          <w:p>
+            <w:r>
+              <w:rPr>
+                <w:sz w:val="20"/>
+                <w:szCs w:val="20"/>
+              </w:rPr>
+              <w:t>X1 (earlier)</w:t>
+            </w:r>
+          </w:p>
+        </w:tc>
+      </w:tr>
+      <w:tr>
+        <w:tblPrEx>
+          <w:tblCellMar>
+            <w:top w:w="0" w:type="dxa"/>
+            <w:bottom w:w="0" w:type="dxa"/>
+          </w:tblCellMar>
+        </w:tblPrEx>
+        <w:tc>
+          <w:tcPr>
+            <w:tcW w:w="3120" w:type="dxa"/>
+            <w:tcBorders>
+              <w:top w:val="single" w:sz="1" w:space="0" w:color="BBAE8C"/>
+              <w:left w:val="single" w:sz="1" w:space="0" w:color="BBAE8C"/>
+              <w:bottom w:val="single" w:sz="1" w:space="0" w:color="BBAE8C"/>
+              <w:right w:val="single" w:sz="1" w:space="0" w:color="BBAE8C"/>
+            </w:tcBorders>
+            <w:tcMar>
+              <w:top w:w="60" w:type="dxa"/>
+              <w:left w:w="110" w:type="dxa"/>
+              <w:bottom w:w="60" w:type="dxa"/>
+              <w:right w:w="110" w:type="dxa"/>
+            </w:tcMar>
+          </w:tcPr>
+          <w:p>
+            <w:r>
+              <w:rPr>
+                <w:sz w:val="20"/>
+                <w:szCs w:val="20"/>
+              </w:rPr>
+              <w:t>Phoenix 2040</w:t>
+            </w:r>
+          </w:p>
+        </w:tc>
+        <w:tc>
+          <w:tcPr>
+            <w:tcW w:w="2340" w:type="dxa"/>
+            <w:tcBorders>
+              <w:top w:val="single" w:sz="1" w:space="0" w:color="BBAE8C"/>
+              <w:left w:val="single" w:sz="1" w:space="0" w:color="BBAE8C"/>
+              <w:bottom w:val="single" w:sz="1" w:space="0" w:color="BBAE8C"/>
+              <w:right w:val="single" w:sz="1" w:space="0" w:color="BBAE8C"/>
+            </w:tcBorders>
+            <w:tcMar>
+              <w:top w:w="60" w:type="dxa"/>
+              <w:left w:w="110" w:type="dxa"/>
+              <w:bottom w:w="60" w:type="dxa"/>
+              <w:right w:w="110" w:type="dxa"/>
+            </w:tcMar>
+          </w:tcPr>
+          <w:p>
+            <w:r>
+              <w:rPr>
+                <w:sz w:val="20"/>
+                <w:szCs w:val="20"/>
+              </w:rPr>
+              <w:t>15 May 2040 CE</w:t>
+            </w:r>
+          </w:p>
+        </w:tc>
+        <w:tc>
+          <w:tcPr>
+            <w:tcW w:w="2000" w:type="dxa"/>
+            <w:tcBorders>
+              <w:top w:val="single" w:sz="1" w:space="0" w:color="BBAE8C"/>
+              <w:left w:val="single" w:sz="1" w:space="0" w:color="BBAE8C"/>
+              <w:bottom w:val="single" w:sz="1" w:space="0" w:color="BBAE8C"/>
+              <w:right w:val="single" w:sz="1" w:space="0" w:color="BBAE8C"/>
+            </w:tcBorders>
+            <w:tcMar>
+              <w:top w:w="60" w:type="dxa"/>
+              <w:left w:w="110" w:type="dxa"/>
+              <w:bottom w:w="60" w:type="dxa"/>
+              <w:right w:w="110" w:type="dxa"/>
+            </w:tcMar>
+          </w:tcPr>
+          <w:p>
+            <w:r>
+              <w:rPr>
+                <w:rFonts w:ascii="Consolas" w:eastAsia="Consolas" w:hAnsi="Consolas" w:cs="Consolas"/>
+                <w:sz w:val="18"/>
+                <w:szCs w:val="18"/>
+              </w:rPr>
+              <w:t>2,466,290</w:t>
+            </w:r>
+          </w:p>
+        </w:tc>
+        <w:tc>
+          <w:tcPr>
+            <w:tcW w:w="1900" w:type="dxa"/>
+            <w:tcBorders>
+              <w:top w:val="single" w:sz="1" w:space="0" w:color="BBAE8C"/>
+              <w:left w:val="single" w:sz="1" w:space="0" w:color="BBAE8C"/>
+              <w:bottom w:val="single" w:sz="1" w:space="0" w:color="BBAE8C"/>
+              <w:right w:val="single" w:sz="1" w:space="0" w:color="BBAE8C"/>
+            </w:tcBorders>
+            <w:tcMar>
+              <w:top w:w="60" w:type="dxa"/>
+              <w:left w:w="110" w:type="dxa"/>
+              <w:bottom w:w="60" w:type="dxa"/>
+              <w:right w:w="110" w:type="dxa"/>
+            </w:tcMar>
+          </w:tcPr>
+          <w:p>
+            <w:r>
+              <w:rPr>
+                <w:sz w:val="20"/>
+                <w:szCs w:val="20"/>
+              </w:rPr>
+              <w:t>X2 (later)</w:t>
+            </w:r>
+          </w:p>
+        </w:tc>
+      </w:tr>
+    </w:tbl>
+    <w:p>
+      <w:pPr>
+        <w:spacing w:before="120" w:after="120"/>
+      </w:pPr>
+      <w:r>
+        <w:t xml:space="preserve">The interval: </w:t>
+      </w:r>
+      <w:r>
+        <w:rPr>
+          <w:rFonts w:ascii="Consolas" w:eastAsia="Consolas" w:hAnsi="Consolas" w:cs="Consolas"/>
+          <w:sz w:val="19"/>
+          <w:szCs w:val="19"/>
+        </w:rPr>
+        <w:t>Y = 2,466,290 − 903,782 = 1,562,508</w:t>
+      </w:r>
+      <w:r>
+        <w:t xml:space="preserve"> axial rotations (days). It passes the guards (between 1 and 3,000,000).</w:t>
+      </w:r>
+    </w:p>
+    <w:p>
+      <w:pPr>
+        <w:pStyle w:val="Heading2"/>
+      </w:pPr>
+      <w:bookmarkStart w:id="23" w:name="_Toc232180957"/>
+      <w:r>
+        <w:t>A.2 The operation</w:t>
+      </w:r>
+      <w:bookmarkEnd w:id="23"/>
+    </w:p>
+    <w:p>
+      <w:pPr>
+        <w:shd w:val="clear" w:color="auto" w:fill="F4F1E8"/>
+        <w:ind w:left="360"/>
+      </w:pPr>
+      <w:r>
+        <w:rPr>
+          <w:rFonts w:ascii="Consolas" w:eastAsia="Consolas" w:hAnsi="Consolas" w:cs="Consolas"/>
+          <w:sz w:val="17"/>
+          <w:szCs w:val="17"/>
+        </w:rPr>
+        <w:t>X1+oph_round(Y/19)*19          // "snap the interval to the 19-grid,</w:t>
+      </w:r>
+    </w:p>
+    <w:p>
+      <w:pPr>
+        <w:shd w:val="clear" w:color="auto" w:fill="F4F1E8"/>
+        <w:ind w:left="360"/>
+      </w:pPr>
+      <w:r>
+        <w:rPr>
+          <w:rFonts w:ascii="Consolas" w:eastAsia="Consolas" w:hAnsi="Consolas" w:cs="Consolas"/>
+          <w:sz w:val="17"/>
+          <w:szCs w:val="17"/>
+        </w:rPr>
+        <w:t xml:space="preserve">                               //  project it forward from the earlier anchor"</w:t>
+      </w:r>
+    </w:p>
+    <w:p>
+      <w:pPr>
+        <w:shd w:val="clear" w:color="auto" w:fill="F4F1E8"/>
+        <w:ind w:left="360"/>
+      </w:pPr>
+      <w:r>
+        <w:rPr>
+          <w:rFonts w:ascii="Consolas" w:eastAsia="Consolas" w:hAnsi="Consolas" w:cs="Consolas"/>
+          <w:sz w:val="17"/>
+          <w:szCs w:val="17"/>
+        </w:rPr>
+        <w:t xml:space="preserve"> </w:t>
+      </w:r>
+    </w:p>
+    <w:p>
+      <w:pPr>
+        <w:shd w:val="clear" w:color="auto" w:fill="F4F1E8"/>
+        <w:ind w:left="360"/>
+      </w:pPr>
+      <w:r>
+        <w:rPr>
+          <w:rFonts w:ascii="Consolas" w:eastAsia="Consolas" w:hAnsi="Consolas" w:cs="Consolas"/>
+          <w:sz w:val="17"/>
+          <w:szCs w:val="17"/>
+        </w:rPr>
+        <w:t>Y / 19          = 1,562,508 / 19 = 82,237.263…</w:t>
+      </w:r>
+    </w:p>
+    <w:p>
+      <w:pPr>
+        <w:shd w:val="clear" w:color="auto" w:fill="F4F1E8"/>
+        <w:ind w:left="360"/>
+      </w:pPr>
+      <w:r>
+        <w:rPr>
+          <w:rFonts w:ascii="Consolas" w:eastAsia="Consolas" w:hAnsi="Consolas" w:cs="Consolas"/>
+          <w:sz w:val="17"/>
+          <w:szCs w:val="17"/>
+        </w:rPr>
+        <w:t>oph_round(...)  = 82,237        // nearest whole 19-count</w:t>
+      </w:r>
+    </w:p>
+    <w:p>
+      <w:pPr>
+        <w:shd w:val="clear" w:color="auto" w:fill="F4F1E8"/>
+        <w:ind w:left="360"/>
+      </w:pPr>
+      <w:r>
+        <w:rPr>
+          <w:rFonts w:ascii="Consolas" w:eastAsia="Consolas" w:hAnsi="Consolas" w:cs="Consolas"/>
+          <w:sz w:val="17"/>
+          <w:szCs w:val="17"/>
+        </w:rPr>
+        <w:t>× 19            = 1,562,503     // the snapped offset, in days</w:t>
+      </w:r>
+    </w:p>
+    <w:p>
+      <w:pPr>
+        <w:shd w:val="clear" w:color="auto" w:fill="F4F1E8"/>
+        <w:ind w:left="360"/>
+      </w:pPr>
+      <w:r>
+        <w:rPr>
+          <w:rFonts w:ascii="Consolas" w:eastAsia="Consolas" w:hAnsi="Consolas" w:cs="Consolas"/>
+          <w:sz w:val="17"/>
+          <w:szCs w:val="17"/>
+        </w:rPr>
+        <w:t xml:space="preserve"> </w:t>
+      </w:r>
+    </w:p>
+    <w:p>
+      <w:pPr>
+        <w:shd w:val="clear" w:color="auto" w:fill="F4F1E8"/>
+        <w:ind w:left="360"/>
+      </w:pPr>
+      <w:r>
+        <w:rPr>
+          <w:rFonts w:ascii="Consolas" w:eastAsia="Consolas" w:hAnsi="Consolas" w:cs="Consolas"/>
+          <w:sz w:val="17"/>
+          <w:szCs w:val="17"/>
+        </w:rPr>
+        <w:t>ZJD = X1 + offset = 903,782 + 1,562,503 = 2,466,285</w:t>
+      </w:r>
+    </w:p>
+    <w:p>
+      <w:pPr>
+        <w:spacing w:before="120" w:after="120"/>
+      </w:pPr>
+      <w:r>
+        <w:t xml:space="preserve">jdToDate(2,466,285) → </w:t>
+      </w:r>
+      <w:r>
+        <w:rPr>
+          <w:b/>
+          <w:bCs/>
+        </w:rPr>
+        <w:t>10 May 2040 CE</w:t>
+      </w:r>
+      <w:r>
+        <w:t xml:space="preserve"> — which is AM 5934, Long-Count year 5152. The projected year 2040 is inside the −5400…4000 window, so the result is kept.</w:t>
+      </w:r>
+    </w:p>
+    <w:p>
+      <w:pPr>
+        <w:pStyle w:val="Heading2"/>
+      </w:pPr>
+      <w:bookmarkStart w:id="24" w:name="_Toc232180958"/>
+      <w:r>
+        <w:t>A.3 Scoring under V8</w:t>
+      </w:r>
+      <w:bookmarkEnd w:id="24"/>
+    </w:p>
+    <w:tbl>
+      <w:tblPr>
+        <w:tblW w:w="9360" w:type="dxa"/>
+        <w:tblBorders>
+          <w:top w:val="single" w:sz="4" w:space="0" w:color="auto"/>
+          <w:left w:val="single" w:sz="4" w:space="0" w:color="auto"/>
+          <w:bottom w:val="single" w:sz="4" w:space="0" w:color="auto"/>
+          <w:right w:val="single" w:sz="4" w:space="0" w:color="auto"/>
+          <w:insideH w:val="single" w:sz="4" w:space="0" w:color="auto"/>
+          <w:insideV w:val="single" w:sz="4" w:space="0" w:color="auto"/>
+        </w:tblBorders>
+        <w:tblCellMar>
+          <w:left w:w="10" w:type="dxa"/>
+          <w:right w:w="10" w:type="dxa"/>
+        </w:tblCellMar>
+        <w:tblLook w:val="04A0" w:firstRow="1" w:lastRow="0" w:firstColumn="1" w:lastColumn="0" w:noHBand="0" w:noVBand="1"/>
+      </w:tblPr>
+      <w:tblGrid>
+        <w:gridCol w:w="3700"/>
+        <w:gridCol w:w="4160"/>
+        <w:gridCol w:w="1500"/>
+      </w:tblGrid>
+      <w:tr>
+        <w:tblPrEx>
+          <w:tblCellMar>
+            <w:top w:w="0" w:type="dxa"/>
+            <w:bottom w:w="0" w:type="dxa"/>
+          </w:tblCellMar>
+        </w:tblPrEx>
+        <w:trPr>
+          <w:tblHeader/>
+        </w:trPr>
+        <w:tc>
+          <w:tcPr>
+            <w:tcW w:w="3700" w:type="dxa"/>
+            <w:tcBorders>
+              <w:top w:val="single" w:sz="1" w:space="0" w:color="BBAE8C"/>
+              <w:left w:val="single" w:sz="1" w:space="0" w:color="BBAE8C"/>
+              <w:bottom w:val="single" w:sz="1" w:space="0" w:color="BBAE8C"/>
+              <w:right w:val="single" w:sz="1" w:space="0" w:color="BBAE8C"/>
+            </w:tcBorders>
+            <w:shd w:val="clear" w:color="auto" w:fill="E8DFC8"/>
+            <w:tcMar>
+              <w:top w:w="60" w:type="dxa"/>
+              <w:left w:w="110" w:type="dxa"/>
+              <w:bottom w:w="60" w:type="dxa"/>
+              <w:right w:w="110" w:type="dxa"/>
+            </w:tcMar>
+          </w:tcPr>
+          <w:p>
+            <w:r>
+              <w:rPr>
+                <w:b/>
+                <w:bCs/>
+                <w:sz w:val="19"/>
+                <w:szCs w:val="19"/>
+              </w:rPr>
+              <w:t>Check</w:t>
+            </w:r>
+          </w:p>
+        </w:tc>
+        <w:tc>
+          <w:tcPr>
+            <w:tcW w:w="4160" w:type="dxa"/>
+            <w:tcBorders>
+              <w:top w:val="single" w:sz="1" w:space="0" w:color="BBAE8C"/>
+              <w:left w:val="single" w:sz="1" w:space="0" w:color="BBAE8C"/>
+              <w:bottom w:val="single" w:sz="1" w:space="0" w:color="BBAE8C"/>
+              <w:right w:val="single" w:sz="1" w:space="0" w:color="BBAE8C"/>
+            </w:tcBorders>
+            <w:shd w:val="clear" w:color="auto" w:fill="E8DFC8"/>
+            <w:tcMar>
+              <w:top w:w="60" w:type="dxa"/>
+              <w:left w:w="110" w:type="dxa"/>
+              <w:bottom w:w="60" w:type="dxa"/>
+              <w:right w:w="110" w:type="dxa"/>
+            </w:tcMar>
+          </w:tcPr>
+          <w:p>
+            <w:r>
+              <w:rPr>
+                <w:b/>
+                <w:bCs/>
+                <w:sz w:val="19"/>
+                <w:szCs w:val="19"/>
+              </w:rPr>
+              <w:t>Computation</w:t>
+            </w:r>
+          </w:p>
+        </w:tc>
+        <w:tc>
+          <w:tcPr>
+            <w:tcW w:w="1500" w:type="dxa"/>
+            <w:tcBorders>
+              <w:top w:val="single" w:sz="1" w:space="0" w:color="BBAE8C"/>
+              <w:left w:val="single" w:sz="1" w:space="0" w:color="BBAE8C"/>
+              <w:bottom w:val="single" w:sz="1" w:space="0" w:color="BBAE8C"/>
+              <w:right w:val="single" w:sz="1" w:space="0" w:color="BBAE8C"/>
+            </w:tcBorders>
+            <w:shd w:val="clear" w:color="auto" w:fill="E8DFC8"/>
+            <w:tcMar>
+              <w:top w:w="60" w:type="dxa"/>
+              <w:left w:w="110" w:type="dxa"/>
+              <w:bottom w:w="60" w:type="dxa"/>
+              <w:right w:w="110" w:type="dxa"/>
+            </w:tcMar>
+          </w:tcPr>
+          <w:p>
+            <w:r>
+              <w:rPr>
+                <w:b/>
+                <w:bCs/>
+                <w:sz w:val="19"/>
+                <w:szCs w:val="19"/>
+              </w:rPr>
+              <w:t>Points</w:t>
+            </w:r>
+          </w:p>
+        </w:tc>
+      </w:tr>
+      <w:tr>
+        <w:tblPrEx>
+          <w:tblCellMar>
+            <w:top w:w="0" w:type="dxa"/>
+            <w:bottom w:w="0" w:type="dxa"/>
+          </w:tblCellMar>
+        </w:tblPrEx>
+        <w:tc>
+          <w:tcPr>
+            <w:tcW w:w="3700" w:type="dxa"/>
+            <w:tcBorders>
+              <w:top w:val="single" w:sz="1" w:space="0" w:color="BBAE8C"/>
+              <w:left w:val="single" w:sz="1" w:space="0" w:color="BBAE8C"/>
+              <w:bottom w:val="single" w:sz="1" w:space="0" w:color="BBAE8C"/>
+              <w:right w:val="single" w:sz="1" w:space="0" w:color="BBAE8C"/>
+            </w:tcBorders>
+            <w:tcMar>
+              <w:top w:w="60" w:type="dxa"/>
+              <w:left w:w="110" w:type="dxa"/>
+              <w:bottom w:w="60" w:type="dxa"/>
+              <w:right w:w="110" w:type="dxa"/>
+            </w:tcMar>
+          </w:tcPr>
+          <w:p>
+            <w:r>
+              <w:rPr>
+                <w:sz w:val="20"/>
+                <w:szCs w:val="20"/>
+              </w:rPr>
+              <w:t>Phoenix node</w:t>
+            </w:r>
+          </w:p>
+        </w:tc>
+        <w:tc>
+          <w:tcPr>
+            <w:tcW w:w="4160" w:type="dxa"/>
+            <w:tcBorders>
+              <w:top w:val="single" w:sz="1" w:space="0" w:color="BBAE8C"/>
+              <w:left w:val="single" w:sz="1" w:space="0" w:color="BBAE8C"/>
+              <w:bottom w:val="single" w:sz="1" w:space="0" w:color="BBAE8C"/>
+              <w:right w:val="single" w:sz="1" w:space="0" w:color="BBAE8C"/>
+            </w:tcBorders>
+            <w:tcMar>
+              <w:top w:w="60" w:type="dxa"/>
+              <w:left w:w="110" w:type="dxa"/>
+              <w:bottom w:w="60" w:type="dxa"/>
+              <w:right w:w="110" w:type="dxa"/>
+            </w:tcMar>
+          </w:tcPr>
+          <w:p>
+            <w:r>
+              <w:rPr>
+                <w:rFonts w:ascii="Consolas" w:eastAsia="Consolas" w:hAnsi="Consolas" w:cs="Consolas"/>
+                <w:sz w:val="18"/>
+                <w:szCs w:val="18"/>
+              </w:rPr>
+              <w:t>2040 mod 138 = 108  ✓</w:t>
+            </w:r>
+          </w:p>
+        </w:tc>
+        <w:tc>
+          <w:tcPr>
+            <w:tcW w:w="1500" w:type="dxa"/>
+            <w:tcBorders>
+              <w:top w:val="single" w:sz="1" w:space="0" w:color="BBAE8C"/>
+              <w:left w:val="single" w:sz="1" w:space="0" w:color="BBAE8C"/>
+              <w:bottom w:val="single" w:sz="1" w:space="0" w:color="BBAE8C"/>
+              <w:right w:val="single" w:sz="1" w:space="0" w:color="BBAE8C"/>
+            </w:tcBorders>
+            <w:tcMar>
+              <w:top w:w="60" w:type="dxa"/>
+              <w:left w:w="110" w:type="dxa"/>
+              <w:bottom w:w="60" w:type="dxa"/>
+              <w:right w:w="110" w:type="dxa"/>
+            </w:tcMar>
+          </w:tcPr>
+          <w:p>
+            <w:r>
+              <w:rPr>
+                <w:sz w:val="20"/>
+                <w:szCs w:val="20"/>
+              </w:rPr>
+              <w:t>+5</w:t>
+            </w:r>
+          </w:p>
+        </w:tc>
+      </w:tr>
+      <w:tr>
+        <w:tblPrEx>
+          <w:tblCellMar>
+            <w:top w:w="0" w:type="dxa"/>
+            <w:bottom w:w="0" w:type="dxa"/>
+          </w:tblCellMar>
+        </w:tblPrEx>
+        <w:tc>
+          <w:tcPr>
+            <w:tcW w:w="3700" w:type="dxa"/>
+            <w:tcBorders>
+              <w:top w:val="single" w:sz="1" w:space="0" w:color="BBAE8C"/>
+              <w:left w:val="single" w:sz="1" w:space="0" w:color="BBAE8C"/>
+              <w:bottom w:val="single" w:sz="1" w:space="0" w:color="BBAE8C"/>
+              <w:right w:val="single" w:sz="1" w:space="0" w:color="BBAE8C"/>
+            </w:tcBorders>
+            <w:tcMar>
+              <w:top w:w="60" w:type="dxa"/>
+              <w:left w:w="110" w:type="dxa"/>
+              <w:bottom w:w="60" w:type="dxa"/>
+              <w:right w:w="110" w:type="dxa"/>
+            </w:tcMar>
+          </w:tcPr>
+          <w:p>
+            <w:r>
+              <w:rPr>
+                <w:sz w:val="20"/>
+                <w:szCs w:val="20"/>
+              </w:rPr>
+              <w:t>Documented event</w:t>
+            </w:r>
+          </w:p>
+        </w:tc>
+        <w:tc>
+          <w:tcPr>
+            <w:tcW w:w="4160" w:type="dxa"/>
+            <w:tcBorders>
+              <w:top w:val="single" w:sz="1" w:space="0" w:color="BBAE8C"/>
+              <w:left w:val="single" w:sz="1" w:space="0" w:color="BBAE8C"/>
+              <w:bottom w:val="single" w:sz="1" w:space="0" w:color="BBAE8C"/>
+              <w:right w:val="single" w:sz="1" w:space="0" w:color="BBAE8C"/>
+            </w:tcBorders>
+            <w:tcMar>
+              <w:top w:w="60" w:type="dxa"/>
+              <w:left w:w="110" w:type="dxa"/>
+              <w:bottom w:w="60" w:type="dxa"/>
+              <w:right w:w="110" w:type="dxa"/>
+            </w:tcMar>
+          </w:tcPr>
+          <w:p>
+            <w:r>
+              <w:rPr>
+                <w:rFonts w:ascii="Consolas" w:eastAsia="Consolas" w:hAnsi="Consolas" w:cs="Consolas"/>
+                <w:sz w:val="18"/>
+                <w:szCs w:val="18"/>
+              </w:rPr>
+              <w:t>2040 is in the ledger  ✓</w:t>
+            </w:r>
+          </w:p>
+        </w:tc>
+        <w:tc>
+          <w:tcPr>
+            <w:tcW w:w="1500" w:type="dxa"/>
+            <w:tcBorders>
+              <w:top w:val="single" w:sz="1" w:space="0" w:color="BBAE8C"/>
+              <w:left w:val="single" w:sz="1" w:space="0" w:color="BBAE8C"/>
+              <w:bottom w:val="single" w:sz="1" w:space="0" w:color="BBAE8C"/>
+              <w:right w:val="single" w:sz="1" w:space="0" w:color="BBAE8C"/>
+            </w:tcBorders>
+            <w:tcMar>
+              <w:top w:w="60" w:type="dxa"/>
+              <w:left w:w="110" w:type="dxa"/>
+              <w:bottom w:w="60" w:type="dxa"/>
+              <w:right w:w="110" w:type="dxa"/>
+            </w:tcMar>
+          </w:tcPr>
+          <w:p>
+            <w:r>
+              <w:rPr>
+                <w:sz w:val="20"/>
+                <w:szCs w:val="20"/>
+              </w:rPr>
+              <w:t>+5</w:t>
+            </w:r>
+          </w:p>
+        </w:tc>
+      </w:tr>
+      <w:tr>
+        <w:tblPrEx>
+          <w:tblCellMar>
+            <w:top w:w="0" w:type="dxa"/>
+            <w:bottom w:w="0" w:type="dxa"/>
+          </w:tblCellMar>
+        </w:tblPrEx>
+        <w:tc>
+          <w:tcPr>
+            <w:tcW w:w="3700" w:type="dxa"/>
+            <w:tcBorders>
+              <w:top w:val="single" w:sz="1" w:space="0" w:color="BBAE8C"/>
+              <w:left w:val="single" w:sz="1" w:space="0" w:color="BBAE8C"/>
+              <w:bottom w:val="single" w:sz="1" w:space="0" w:color="BBAE8C"/>
+              <w:right w:val="single" w:sz="1" w:space="0" w:color="BBAE8C"/>
+            </w:tcBorders>
+            <w:tcMar>
+              <w:top w:w="60" w:type="dxa"/>
+              <w:left w:w="110" w:type="dxa"/>
+              <w:bottom w:w="60" w:type="dxa"/>
+              <w:right w:w="110" w:type="dxa"/>
+            </w:tcMar>
+          </w:tcPr>
+          <w:p>
+            <w:r>
+              <w:rPr>
+                <w:sz w:val="20"/>
+                <w:szCs w:val="20"/>
+              </w:rPr>
+              <w:t>Palindrome</w:t>
+            </w:r>
+          </w:p>
+        </w:tc>
+        <w:tc>
+          <w:tcPr>
+            <w:tcW w:w="4160" w:type="dxa"/>
+            <w:tcBorders>
+              <w:top w:val="single" w:sz="1" w:space="0" w:color="BBAE8C"/>
+              <w:left w:val="single" w:sz="1" w:space="0" w:color="BBAE8C"/>
+              <w:bottom w:val="single" w:sz="1" w:space="0" w:color="BBAE8C"/>
+              <w:right w:val="single" w:sz="1" w:space="0" w:color="BBAE8C"/>
+            </w:tcBorders>
+            <w:tcMar>
+              <w:top w:w="60" w:type="dxa"/>
+              <w:left w:w="110" w:type="dxa"/>
+              <w:bottom w:w="60" w:type="dxa"/>
+              <w:right w:w="110" w:type="dxa"/>
+            </w:tcMar>
+          </w:tcPr>
+          <w:p>
+            <w:r>
+              <w:rPr>
+                <w:rFonts w:ascii="Consolas" w:eastAsia="Consolas" w:hAnsi="Consolas" w:cs="Consolas"/>
+                <w:sz w:val="18"/>
+                <w:szCs w:val="18"/>
+              </w:rPr>
+              <w:t>2040 / 5934 / 2466285 — none  ✗</w:t>
+            </w:r>
+          </w:p>
+        </w:tc>
+        <w:tc>
+          <w:tcPr>
+            <w:tcW w:w="1500" w:type="dxa"/>
+            <w:tcBorders>
+              <w:top w:val="single" w:sz="1" w:space="0" w:color="BBAE8C"/>
+              <w:left w:val="single" w:sz="1" w:space="0" w:color="BBAE8C"/>
+              <w:bottom w:val="single" w:sz="1" w:space="0" w:color="BBAE8C"/>
+              <w:right w:val="single" w:sz="1" w:space="0" w:color="BBAE8C"/>
+            </w:tcBorders>
+            <w:tcMar>
+              <w:top w:w="60" w:type="dxa"/>
+              <w:left w:w="110" w:type="dxa"/>
+              <w:bottom w:w="60" w:type="dxa"/>
+              <w:right w:w="110" w:type="dxa"/>
+            </w:tcMar>
+          </w:tcPr>
+          <w:p>
+            <w:r>
+              <w:rPr>
+                <w:sz w:val="20"/>
+                <w:szCs w:val="20"/>
+              </w:rPr>
+              <w:t>0</w:t>
+            </w:r>
+          </w:p>
+        </w:tc>
+      </w:tr>
+      <w:tr>
+        <w:tblPrEx>
+          <w:tblCellMar>
+            <w:top w:w="0" w:type="dxa"/>
+            <w:bottom w:w="0" w:type="dxa"/>
+          </w:tblCellMar>
+        </w:tblPrEx>
+        <w:tc>
+          <w:tcPr>
+            <w:tcW w:w="3700" w:type="dxa"/>
+            <w:tcBorders>
+              <w:top w:val="single" w:sz="1" w:space="0" w:color="BBAE8C"/>
+              <w:left w:val="single" w:sz="1" w:space="0" w:color="BBAE8C"/>
+              <w:bottom w:val="single" w:sz="1" w:space="0" w:color="BBAE8C"/>
+              <w:right w:val="single" w:sz="1" w:space="0" w:color="BBAE8C"/>
+            </w:tcBorders>
+            <w:tcMar>
+              <w:top w:w="60" w:type="dxa"/>
+              <w:left w:w="110" w:type="dxa"/>
+              <w:bottom w:w="60" w:type="dxa"/>
+              <w:right w:w="110" w:type="dxa"/>
+            </w:tcMar>
+          </w:tcPr>
+          <w:p>
+            <w:r>
+              <w:rPr>
+                <w:sz w:val="20"/>
+                <w:szCs w:val="20"/>
+              </w:rPr>
+              <w:t>138 in digits</w:t>
+            </w:r>
+          </w:p>
+        </w:tc>
+        <w:tc>
+          <w:tcPr>
+            <w:tcW w:w="4160" w:type="dxa"/>
+            <w:tcBorders>
+              <w:top w:val="single" w:sz="1" w:space="0" w:color="BBAE8C"/>
+              <w:left w:val="single" w:sz="1" w:space="0" w:color="BBAE8C"/>
+              <w:bottom w:val="single" w:sz="1" w:space="0" w:color="BBAE8C"/>
+              <w:right w:val="single" w:sz="1" w:space="0" w:color="BBAE8C"/>
+            </w:tcBorders>
+            <w:tcMar>
+              <w:top w:w="60" w:type="dxa"/>
+              <w:left w:w="110" w:type="dxa"/>
+              <w:bottom w:w="60" w:type="dxa"/>
+              <w:right w:w="110" w:type="dxa"/>
+            </w:tcMar>
+          </w:tcPr>
+          <w:p>
+            <w:r>
+              <w:rPr>
+                <w:rFonts w:ascii="Consolas" w:eastAsia="Consolas" w:hAnsi="Consolas" w:cs="Consolas"/>
+                <w:sz w:val="18"/>
+                <w:szCs w:val="18"/>
+              </w:rPr>
+              <w:t>2040, 5934, 5152 — none  ✗</w:t>
+            </w:r>
+          </w:p>
+        </w:tc>
+        <w:tc>
+          <w:tcPr>
+            <w:tcW w:w="1500" w:type="dxa"/>
+            <w:tcBorders>
+              <w:top w:val="single" w:sz="1" w:space="0" w:color="BBAE8C"/>
+              <w:left w:val="single" w:sz="1" w:space="0" w:color="BBAE8C"/>
+              <w:bottom w:val="single" w:sz="1" w:space="0" w:color="BBAE8C"/>
+              <w:right w:val="single" w:sz="1" w:space="0" w:color="BBAE8C"/>
+            </w:tcBorders>
+            <w:tcMar>
+              <w:top w:w="60" w:type="dxa"/>
+              <w:left w:w="110" w:type="dxa"/>
+              <w:bottom w:w="60" w:type="dxa"/>
+              <w:right w:w="110" w:type="dxa"/>
+            </w:tcMar>
+          </w:tcPr>
+          <w:p>
+            <w:r>
+              <w:rPr>
+                <w:sz w:val="20"/>
+                <w:szCs w:val="20"/>
+              </w:rPr>
+              <w:t>0</w:t>
+            </w:r>
+          </w:p>
+        </w:tc>
+      </w:tr>
+      <w:tr>
+        <w:tblPrEx>
+          <w:tblCellMar>
+            <w:top w:w="0" w:type="dxa"/>
+            <w:bottom w:w="0" w:type="dxa"/>
+          </w:tblCellMar>
+        </w:tblPrEx>
+        <w:tc>
+          <w:tcPr>
+            <w:tcW w:w="3700" w:type="dxa"/>
+            <w:tcBorders>
+              <w:top w:val="single" w:sz="1" w:space="0" w:color="BBAE8C"/>
+              <w:left w:val="single" w:sz="1" w:space="0" w:color="BBAE8C"/>
+              <w:bottom w:val="single" w:sz="1" w:space="0" w:color="BBAE8C"/>
+              <w:right w:val="single" w:sz="1" w:space="0" w:color="BBAE8C"/>
+            </w:tcBorders>
+            <w:tcMar>
+              <w:top w:w="60" w:type="dxa"/>
+              <w:left w:w="110" w:type="dxa"/>
+              <w:bottom w:w="60" w:type="dxa"/>
+              <w:right w:w="110" w:type="dxa"/>
+            </w:tcMar>
+          </w:tcPr>
+          <w:p>
+            <w:r>
+              <w:rPr>
+                <w:sz w:val="20"/>
+                <w:szCs w:val="20"/>
+              </w:rPr>
+              <w:t>Metonic-19 to today</w:t>
+            </w:r>
+          </w:p>
+        </w:tc>
+        <w:tc>
+          <w:tcPr>
+            <w:tcW w:w="4160" w:type="dxa"/>
+            <w:tcBorders>
+              <w:top w:val="single" w:sz="1" w:space="0" w:color="BBAE8C"/>
+              <w:left w:val="single" w:sz="1" w:space="0" w:color="BBAE8C"/>
+              <w:bottom w:val="single" w:sz="1" w:space="0" w:color="BBAE8C"/>
+              <w:right w:val="single" w:sz="1" w:space="0" w:color="BBAE8C"/>
+            </w:tcBorders>
+            <w:tcMar>
+              <w:top w:w="60" w:type="dxa"/>
+              <w:left w:w="110" w:type="dxa"/>
+              <w:bottom w:w="60" w:type="dxa"/>
+              <w:right w:w="110" w:type="dxa"/>
+            </w:tcMar>
+          </w:tcPr>
+          <w:p>
+            <w:r>
+              <w:rPr>
+                <w:rFonts w:ascii="Consolas" w:eastAsia="Consolas" w:hAnsi="Consolas" w:cs="Consolas"/>
+                <w:sz w:val="18"/>
+                <w:szCs w:val="18"/>
+              </w:rPr>
+              <w:t>(2026 − 2040) mod 19 = 5  ✗</w:t>
+            </w:r>
+          </w:p>
+        </w:tc>
+        <w:tc>
+          <w:tcPr>
+            <w:tcW w:w="1500" w:type="dxa"/>
+            <w:tcBorders>
+              <w:top w:val="single" w:sz="1" w:space="0" w:color="BBAE8C"/>
+              <w:left w:val="single" w:sz="1" w:space="0" w:color="BBAE8C"/>
+              <w:bottom w:val="single" w:sz="1" w:space="0" w:color="BBAE8C"/>
+              <w:right w:val="single" w:sz="1" w:space="0" w:color="BBAE8C"/>
+            </w:tcBorders>
+            <w:tcMar>
+              <w:top w:w="60" w:type="dxa"/>
+              <w:left w:w="110" w:type="dxa"/>
+              <w:bottom w:w="60" w:type="dxa"/>
+              <w:right w:w="110" w:type="dxa"/>
+            </w:tcMar>
+          </w:tcPr>
+          <w:p>
+            <w:r>
+              <w:rPr>
+                <w:sz w:val="20"/>
+                <w:szCs w:val="20"/>
+              </w:rPr>
+              <w:t>0</w:t>
+            </w:r>
+          </w:p>
+        </w:tc>
+      </w:tr>
+      <w:tr>
+        <w:tblPrEx>
+          <w:tblCellMar>
+            <w:top w:w="0" w:type="dxa"/>
+            <w:bottom w:w="0" w:type="dxa"/>
+          </w:tblCellMar>
+        </w:tblPrEx>
+        <w:tc>
+          <w:tcPr>
+            <w:tcW w:w="3700" w:type="dxa"/>
+            <w:tcBorders>
+              <w:top w:val="single" w:sz="1" w:space="0" w:color="BBAE8C"/>
+              <w:left w:val="single" w:sz="1" w:space="0" w:color="BBAE8C"/>
+              <w:bottom w:val="single" w:sz="1" w:space="0" w:color="BBAE8C"/>
+              <w:right w:val="single" w:sz="1" w:space="0" w:color="BBAE8C"/>
+            </w:tcBorders>
+            <w:tcMar>
+              <w:top w:w="60" w:type="dxa"/>
+              <w:left w:w="110" w:type="dxa"/>
+              <w:bottom w:w="60" w:type="dxa"/>
+              <w:right w:w="110" w:type="dxa"/>
+            </w:tcMar>
+          </w:tcPr>
+          <w:p>
+            <w:r>
+              <w:rPr>
+                <w:sz w:val="20"/>
+                <w:szCs w:val="20"/>
+              </w:rPr>
+              <w:t>19 in digits</w:t>
+            </w:r>
+          </w:p>
+        </w:tc>
+        <w:tc>
+          <w:tcPr>
+            <w:tcW w:w="4160" w:type="dxa"/>
+            <w:tcBorders>
+              <w:top w:val="single" w:sz="1" w:space="0" w:color="BBAE8C"/>
+              <w:left w:val="single" w:sz="1" w:space="0" w:color="BBAE8C"/>
+              <w:bottom w:val="single" w:sz="1" w:space="0" w:color="BBAE8C"/>
+              <w:right w:val="single" w:sz="1" w:space="0" w:color="BBAE8C"/>
+            </w:tcBorders>
+            <w:tcMar>
+              <w:top w:w="60" w:type="dxa"/>
+              <w:left w:w="110" w:type="dxa"/>
+              <w:bottom w:w="60" w:type="dxa"/>
+              <w:right w:w="110" w:type="dxa"/>
+            </w:tcMar>
+          </w:tcPr>
+          <w:p>
+            <w:r>
+              <w:rPr>
+                <w:rFonts w:ascii="Consolas" w:eastAsia="Consolas" w:hAnsi="Consolas" w:cs="Consolas"/>
+                <w:sz w:val="18"/>
+                <w:szCs w:val="18"/>
+              </w:rPr>
+              <w:t>2040, 5934 — none  ✗</w:t>
+            </w:r>
+          </w:p>
+        </w:tc>
+        <w:tc>
+          <w:tcPr>
+            <w:tcW w:w="1500" w:type="dxa"/>
+            <w:tcBorders>
+              <w:top w:val="single" w:sz="1" w:space="0" w:color="BBAE8C"/>
+              <w:left w:val="single" w:sz="1" w:space="0" w:color="BBAE8C"/>
+              <w:bottom w:val="single" w:sz="1" w:space="0" w:color="BBAE8C"/>
+              <w:right w:val="single" w:sz="1" w:space="0" w:color="BBAE8C"/>
+            </w:tcBorders>
+            <w:tcMar>
+              <w:top w:w="60" w:type="dxa"/>
+              <w:left w:w="110" w:type="dxa"/>
+              <w:bottom w:w="60" w:type="dxa"/>
+              <w:right w:w="110" w:type="dxa"/>
+            </w:tcMar>
+          </w:tcPr>
+          <w:p>
+            <w:r>
+              <w:rPr>
+                <w:sz w:val="20"/>
+                <w:szCs w:val="20"/>
+              </w:rPr>
+              <w:t>0</w:t>
+            </w:r>
+          </w:p>
+        </w:tc>
+      </w:tr>
+      <w:tr>
+        <w:tblPrEx>
+          <w:tblCellMar>
+            <w:top w:w="0" w:type="dxa"/>
+            <w:bottom w:w="0" w:type="dxa"/>
+          </w:tblCellMar>
+        </w:tblPrEx>
+        <w:tc>
+          <w:tcPr>
+            <w:tcW w:w="3700" w:type="dxa"/>
+            <w:tcBorders>
+              <w:top w:val="single" w:sz="1" w:space="0" w:color="BBAE8C"/>
+              <w:left w:val="single" w:sz="1" w:space="0" w:color="BBAE8C"/>
+              <w:bottom w:val="single" w:sz="1" w:space="0" w:color="BBAE8C"/>
+              <w:right w:val="single" w:sz="1" w:space="0" w:color="BBAE8C"/>
+            </w:tcBorders>
+            <w:tcMar>
+              <w:top w:w="60" w:type="dxa"/>
+              <w:left w:w="110" w:type="dxa"/>
+              <w:bottom w:w="60" w:type="dxa"/>
+              <w:right w:w="110" w:type="dxa"/>
+            </w:tcMar>
+          </w:tcPr>
+          <w:p>
+            <w:r>
+              <w:rPr>
+                <w:sz w:val="20"/>
+                <w:szCs w:val="20"/>
+              </w:rPr>
+              <w:t>MSRF on Y or offset</w:t>
+            </w:r>
+          </w:p>
+        </w:tc>
+        <w:tc>
+          <w:tcPr>
+            <w:tcW w:w="4160" w:type="dxa"/>
+            <w:tcBorders>
+              <w:top w:val="single" w:sz="1" w:space="0" w:color="BBAE8C"/>
+              <w:left w:val="single" w:sz="1" w:space="0" w:color="BBAE8C"/>
+              <w:bottom w:val="single" w:sz="1" w:space="0" w:color="BBAE8C"/>
+              <w:right w:val="single" w:sz="1" w:space="0" w:color="BBAE8C"/>
+            </w:tcBorders>
+            <w:tcMar>
+              <w:top w:w="60" w:type="dxa"/>
+              <w:left w:w="110" w:type="dxa"/>
+              <w:bottom w:w="60" w:type="dxa"/>
+              <w:right w:w="110" w:type="dxa"/>
+            </w:tcMar>
+          </w:tcPr>
+          <w:p>
+            <w:r>
+              <w:rPr>
+                <w:rFonts w:ascii="Consolas" w:eastAsia="Consolas" w:hAnsi="Consolas" w:cs="Consolas"/>
+                <w:sz w:val="18"/>
+                <w:szCs w:val="18"/>
+              </w:rPr>
+              <w:t>1,562,508 / 1,562,503 not in set  ✗</w:t>
+            </w:r>
+          </w:p>
+        </w:tc>
+        <w:tc>
+          <w:tcPr>
+            <w:tcW w:w="1500" w:type="dxa"/>
+            <w:tcBorders>
+              <w:top w:val="single" w:sz="1" w:space="0" w:color="BBAE8C"/>
+              <w:left w:val="single" w:sz="1" w:space="0" w:color="BBAE8C"/>
+              <w:bottom w:val="single" w:sz="1" w:space="0" w:color="BBAE8C"/>
+              <w:right w:val="single" w:sz="1" w:space="0" w:color="BBAE8C"/>
+            </w:tcBorders>
+            <w:tcMar>
+              <w:top w:w="60" w:type="dxa"/>
+              <w:left w:w="110" w:type="dxa"/>
+              <w:bottom w:w="60" w:type="dxa"/>
+              <w:right w:w="110" w:type="dxa"/>
+            </w:tcMar>
+          </w:tcPr>
+          <w:p>
+            <w:r>
+              <w:rPr>
+                <w:sz w:val="20"/>
+                <w:szCs w:val="20"/>
+              </w:rPr>
+              <w:t>0</w:t>
+            </w:r>
+          </w:p>
+        </w:tc>
+      </w:tr>
+      <w:tr>
+        <w:tblPrEx>
+          <w:tblCellMar>
+            <w:top w:w="0" w:type="dxa"/>
+            <w:bottom w:w="0" w:type="dxa"/>
+          </w:tblCellMar>
+        </w:tblPrEx>
+        <w:tc>
+          <w:tcPr>
+            <w:tcW w:w="3700" w:type="dxa"/>
+            <w:tcBorders>
+              <w:top w:val="single" w:sz="1" w:space="0" w:color="BBAE8C"/>
+              <w:left w:val="single" w:sz="1" w:space="0" w:color="BBAE8C"/>
+              <w:bottom w:val="single" w:sz="1" w:space="0" w:color="BBAE8C"/>
+              <w:right w:val="single" w:sz="1" w:space="0" w:color="BBAE8C"/>
+            </w:tcBorders>
+            <w:tcMar>
+              <w:top w:w="60" w:type="dxa"/>
+              <w:left w:w="110" w:type="dxa"/>
+              <w:bottom w:w="60" w:type="dxa"/>
+              <w:right w:w="110" w:type="dxa"/>
+            </w:tcMar>
+          </w:tcPr>
+          <w:p>
+            <w:r>
+              <w:rPr>
+                <w:sz w:val="20"/>
+                <w:szCs w:val="20"/>
+              </w:rPr>
+              <w:t>Solar eclipse ±1 day</w:t>
+            </w:r>
+          </w:p>
+        </w:tc>
+        <w:tc>
+          <w:tcPr>
+            <w:tcW w:w="4160" w:type="dxa"/>
+            <w:tcBorders>
+              <w:top w:val="single" w:sz="1" w:space="0" w:color="BBAE8C"/>
+              <w:left w:val="single" w:sz="1" w:space="0" w:color="BBAE8C"/>
+              <w:bottom w:val="single" w:sz="1" w:space="0" w:color="BBAE8C"/>
+              <w:right w:val="single" w:sz="1" w:space="0" w:color="BBAE8C"/>
+            </w:tcBorders>
+            <w:tcMar>
+              <w:top w:w="60" w:type="dxa"/>
+              <w:left w:w="110" w:type="dxa"/>
+              <w:bottom w:w="60" w:type="dxa"/>
+              <w:right w:w="110" w:type="dxa"/>
+            </w:tcMar>
+          </w:tcPr>
+          <w:p>
+            <w:r>
+              <w:rPr>
+                <w:rFonts w:ascii="Consolas" w:eastAsia="Consolas" w:hAnsi="Consolas" w:cs="Consolas"/>
+                <w:sz w:val="18"/>
+                <w:szCs w:val="18"/>
+              </w:rPr>
+              <w:t>partial solar, 10 May 2040  ✓</w:t>
+            </w:r>
+          </w:p>
+        </w:tc>
+        <w:tc>
+          <w:tcPr>
+            <w:tcW w:w="1500" w:type="dxa"/>
+            <w:tcBorders>
+              <w:top w:val="single" w:sz="1" w:space="0" w:color="BBAE8C"/>
+              <w:left w:val="single" w:sz="1" w:space="0" w:color="BBAE8C"/>
+              <w:bottom w:val="single" w:sz="1" w:space="0" w:color="BBAE8C"/>
+              <w:right w:val="single" w:sz="1" w:space="0" w:color="BBAE8C"/>
+            </w:tcBorders>
+            <w:tcMar>
+              <w:top w:w="60" w:type="dxa"/>
+              <w:left w:w="110" w:type="dxa"/>
+              <w:bottom w:w="60" w:type="dxa"/>
+              <w:right w:w="110" w:type="dxa"/>
+            </w:tcMar>
+          </w:tcPr>
+          <w:p>
+            <w:r>
+              <w:rPr>
+                <w:sz w:val="20"/>
+                <w:szCs w:val="20"/>
+              </w:rPr>
+              <w:t>+2</w:t>
+            </w:r>
+          </w:p>
+        </w:tc>
+      </w:tr>
+      <w:tr>
+        <w:tblPrEx>
+          <w:tblCellMar>
+            <w:top w:w="0" w:type="dxa"/>
+            <w:bottom w:w="0" w:type="dxa"/>
+          </w:tblCellMar>
+        </w:tblPrEx>
+        <w:tc>
+          <w:tcPr>
+            <w:tcW w:w="3700" w:type="dxa"/>
+            <w:tcBorders>
+              <w:top w:val="single" w:sz="1" w:space="0" w:color="BBAE8C"/>
+              <w:left w:val="single" w:sz="1" w:space="0" w:color="BBAE8C"/>
+              <w:bottom w:val="single" w:sz="1" w:space="0" w:color="BBAE8C"/>
+              <w:right w:val="single" w:sz="1" w:space="0" w:color="BBAE8C"/>
+            </w:tcBorders>
+            <w:tcMar>
+              <w:top w:w="60" w:type="dxa"/>
+              <w:left w:w="110" w:type="dxa"/>
+              <w:bottom w:w="60" w:type="dxa"/>
+              <w:right w:w="110" w:type="dxa"/>
+            </w:tcMar>
+          </w:tcPr>
+          <w:p>
+            <w:r>
+              <w:rPr>
+                <w:sz w:val="20"/>
+                <w:szCs w:val="20"/>
+              </w:rPr>
+              <w:t>Lunar eclipse ±1 day</w:t>
+            </w:r>
+          </w:p>
+        </w:tc>
+        <w:tc>
+          <w:tcPr>
+            <w:tcW w:w="4160" w:type="dxa"/>
+            <w:tcBorders>
+              <w:top w:val="single" w:sz="1" w:space="0" w:color="BBAE8C"/>
+              <w:left w:val="single" w:sz="1" w:space="0" w:color="BBAE8C"/>
+              <w:bottom w:val="single" w:sz="1" w:space="0" w:color="BBAE8C"/>
+              <w:right w:val="single" w:sz="1" w:space="0" w:color="BBAE8C"/>
+            </w:tcBorders>
+            <w:tcMar>
+              <w:top w:w="60" w:type="dxa"/>
+              <w:left w:w="110" w:type="dxa"/>
+              <w:bottom w:w="60" w:type="dxa"/>
+              <w:right w:w="110" w:type="dxa"/>
+            </w:tcMar>
+          </w:tcPr>
+          <w:p>
+            <w:r>
+              <w:rPr>
+                <w:rFonts w:ascii="Consolas" w:eastAsia="Consolas" w:hAnsi="Consolas" w:cs="Consolas"/>
+                <w:sz w:val="18"/>
+                <w:szCs w:val="18"/>
+              </w:rPr>
+              <w:t>none within window  ✗</w:t>
+            </w:r>
+          </w:p>
+        </w:tc>
+        <w:tc>
+          <w:tcPr>
+            <w:tcW w:w="1500" w:type="dxa"/>
+            <w:tcBorders>
+              <w:top w:val="single" w:sz="1" w:space="0" w:color="BBAE8C"/>
+              <w:left w:val="single" w:sz="1" w:space="0" w:color="BBAE8C"/>
+              <w:bottom w:val="single" w:sz="1" w:space="0" w:color="BBAE8C"/>
+              <w:right w:val="single" w:sz="1" w:space="0" w:color="BBAE8C"/>
+            </w:tcBorders>
+            <w:tcMar>
+              <w:top w:w="60" w:type="dxa"/>
+              <w:left w:w="110" w:type="dxa"/>
+              <w:bottom w:w="60" w:type="dxa"/>
+              <w:right w:w="110" w:type="dxa"/>
+            </w:tcMar>
+          </w:tcPr>
+          <w:p>
+            <w:r>
+              <w:rPr>
+                <w:sz w:val="20"/>
+                <w:szCs w:val="20"/>
+              </w:rPr>
+              <w:t>0</w:t>
+            </w:r>
+          </w:p>
+        </w:tc>
+      </w:tr>
+      <w:tr>
+        <w:tblPrEx>
+          <w:tblCellMar>
+            <w:top w:w="0" w:type="dxa"/>
+            <w:bottom w:w="0" w:type="dxa"/>
+          </w:tblCellMar>
+        </w:tblPrEx>
+        <w:tc>
+          <w:tcPr>
+            <w:tcW w:w="3700" w:type="dxa"/>
+            <w:tcBorders>
+              <w:top w:val="single" w:sz="1" w:space="0" w:color="BBAE8C"/>
+              <w:left w:val="single" w:sz="1" w:space="0" w:color="BBAE8C"/>
+              <w:bottom w:val="single" w:sz="1" w:space="0" w:color="BBAE8C"/>
+              <w:right w:val="single" w:sz="1" w:space="0" w:color="BBAE8C"/>
+            </w:tcBorders>
+            <w:tcMar>
+              <w:top w:w="60" w:type="dxa"/>
+              <w:left w:w="110" w:type="dxa"/>
+              <w:bottom w:w="60" w:type="dxa"/>
+              <w:right w:w="110" w:type="dxa"/>
+            </w:tcMar>
+          </w:tcPr>
+          <w:p>
+            <w:r>
+              <w:rPr>
+                <w:sz w:val="20"/>
+                <w:szCs w:val="20"/>
+              </w:rPr>
+              <w:t>Nemesis / NER / baktun</w:t>
+            </w:r>
+          </w:p>
+        </w:tc>
+        <w:tc>
+          <w:tcPr>
+            <w:tcW w:w="4160" w:type="dxa"/>
+            <w:tcBorders>
+              <w:top w:val="single" w:sz="1" w:space="0" w:color="BBAE8C"/>
+              <w:left w:val="single" w:sz="1" w:space="0" w:color="BBAE8C"/>
+              <w:bottom w:val="single" w:sz="1" w:space="0" w:color="BBAE8C"/>
+              <w:right w:val="single" w:sz="1" w:space="0" w:color="BBAE8C"/>
+            </w:tcBorders>
+            <w:tcMar>
+              <w:top w:w="60" w:type="dxa"/>
+              <w:left w:w="110" w:type="dxa"/>
+              <w:bottom w:w="60" w:type="dxa"/>
+              <w:right w:w="110" w:type="dxa"/>
+            </w:tcMar>
+          </w:tcPr>
+          <w:p>
+            <w:r>
+              <w:rPr>
+                <w:rFonts w:ascii="Consolas" w:eastAsia="Consolas" w:hAnsi="Consolas" w:cs="Consolas"/>
+                <w:sz w:val="18"/>
+                <w:szCs w:val="18"/>
+              </w:rPr>
+              <w:t>none  ✗</w:t>
+            </w:r>
+          </w:p>
+        </w:tc>
+        <w:tc>
+          <w:tcPr>
+            <w:tcW w:w="1500" w:type="dxa"/>
+            <w:tcBorders>
+              <w:top w:val="single" w:sz="1" w:space="0" w:color="BBAE8C"/>
+              <w:left w:val="single" w:sz="1" w:space="0" w:color="BBAE8C"/>
+              <w:bottom w:val="single" w:sz="1" w:space="0" w:color="BBAE8C"/>
+              <w:right w:val="single" w:sz="1" w:space="0" w:color="BBAE8C"/>
+            </w:tcBorders>
+            <w:tcMar>
+              <w:top w:w="60" w:type="dxa"/>
+              <w:left w:w="110" w:type="dxa"/>
+              <w:bottom w:w="60" w:type="dxa"/>
+              <w:right w:w="110" w:type="dxa"/>
+            </w:tcMar>
+          </w:tcPr>
+          <w:p>
+            <w:r>
+              <w:rPr>
+                <w:sz w:val="20"/>
+                <w:szCs w:val="20"/>
+              </w:rPr>
+              <w:t>0</w:t>
+            </w:r>
+          </w:p>
+        </w:tc>
+      </w:tr>
+      <w:tr>
+        <w:tblPrEx>
+          <w:tblCellMar>
+            <w:top w:w="0" w:type="dxa"/>
+            <w:bottom w:w="0" w:type="dxa"/>
+          </w:tblCellMar>
+        </w:tblPrEx>
+        <w:tc>
+          <w:tcPr>
+            <w:tcW w:w="3700" w:type="dxa"/>
+            <w:tcBorders>
+              <w:top w:val="single" w:sz="1" w:space="0" w:color="BBAE8C"/>
+              <w:left w:val="single" w:sz="1" w:space="0" w:color="BBAE8C"/>
+              <w:bottom w:val="single" w:sz="1" w:space="0" w:color="BBAE8C"/>
+              <w:right w:val="single" w:sz="1" w:space="0" w:color="BBAE8C"/>
+            </w:tcBorders>
+            <w:tcMar>
+              <w:top w:w="60" w:type="dxa"/>
+              <w:left w:w="110" w:type="dxa"/>
+              <w:bottom w:w="60" w:type="dxa"/>
+              <w:right w:w="110" w:type="dxa"/>
+            </w:tcMar>
+          </w:tcPr>
+          <w:p>
+            <w:r>
+              <w:rPr>
+                <w:b/>
+                <w:bCs/>
+              </w:rPr>
+              <w:t>Final score</w:t>
+            </w:r>
+          </w:p>
+        </w:tc>
+        <w:tc>
+          <w:tcPr>
+            <w:tcW w:w="4160" w:type="dxa"/>
+            <w:tcBorders>
+              <w:top w:val="single" w:sz="1" w:space="0" w:color="BBAE8C"/>
+              <w:left w:val="single" w:sz="1" w:space="0" w:color="BBAE8C"/>
+              <w:bottom w:val="single" w:sz="1" w:space="0" w:color="BBAE8C"/>
+              <w:right w:val="single" w:sz="1" w:space="0" w:color="BBAE8C"/>
+            </w:tcBorders>
+            <w:tcMar>
+              <w:top w:w="60" w:type="dxa"/>
+              <w:left w:w="110" w:type="dxa"/>
+              <w:bottom w:w="60" w:type="dxa"/>
+              <w:right w:w="110" w:type="dxa"/>
+            </w:tcMar>
+          </w:tcPr>
+          <w:p/>
+        </w:tc>
+        <w:tc>
+          <w:tcPr>
+            <w:tcW w:w="1500" w:type="dxa"/>
+            <w:tcBorders>
+              <w:top w:val="single" w:sz="1" w:space="0" w:color="BBAE8C"/>
+              <w:left w:val="single" w:sz="1" w:space="0" w:color="BBAE8C"/>
+              <w:bottom w:val="single" w:sz="1" w:space="0" w:color="BBAE8C"/>
+              <w:right w:val="single" w:sz="1" w:space="0" w:color="BBAE8C"/>
+            </w:tcBorders>
+            <w:tcMar>
+              <w:top w:w="60" w:type="dxa"/>
+              <w:left w:w="110" w:type="dxa"/>
+              <w:bottom w:w="60" w:type="dxa"/>
+              <w:right w:w="110" w:type="dxa"/>
+            </w:tcMar>
+          </w:tcPr>
+          <w:p>
+            <w:r>
+              <w:rPr>
+                <w:b/>
+                <w:bCs/>
+              </w:rPr>
+              <w:t>12</w:t>
+            </w:r>
+          </w:p>
+        </w:tc>
+      </w:tr>
+    </w:tbl>
+    <w:p>
+      <w:pPr>
+        <w:spacing w:before="120" w:after="120"/>
+      </w:pPr>
+      <w:r>
+        <w:t xml:space="preserve">Tags earned: </w:t>
+      </w:r>
+      <w:r>
+        <w:rPr>
+          <w:rFonts w:ascii="Consolas" w:eastAsia="Consolas" w:hAnsi="Consolas" w:cs="Consolas"/>
+          <w:sz w:val="19"/>
+          <w:szCs w:val="19"/>
+        </w:rPr>
+        <w:t>PHOENIX NODE · DOCUMENTED · ☉ SOLAR partial</w:t>
+      </w:r>
+      <w:r>
+        <w:t>.</w:t>
+      </w:r>
+    </w:p>
+    <w:p>
+      <w:pPr>
+        <w:pStyle w:val="Heading2"/>
+      </w:pPr>
+      <w:bookmarkStart w:id="25" w:name="_Toc232180959"/>
+      <w:r>
+        <w:t>A.4 Why it is novel, not an echo</w:t>
+      </w:r>
+      <w:bookmarkEnd w:id="25"/>
+    </w:p>
+    <w:p>
+      <w:pPr>
+        <w:spacing w:after="120"/>
+      </w:pPr>
+      <w:r>
+        <w:t xml:space="preserve">The projection lands at JD 2,466,285 — </w:t>
+      </w:r>
+      <w:r>
+        <w:rPr>
+          <w:b/>
+          <w:bCs/>
+        </w:rPr>
+        <w:t>five days</w:t>
+      </w:r>
+      <w:r>
+        <w:t xml:space="preserve"> before the seeded Phoenix 2040 anchor (JD 2,466,290). The echo test requires ±1 day of an input anchor, so this row is </w:t>
+      </w:r>
+      <w:r>
+        <w:rPr>
+          <w:b/>
+          <w:bCs/>
+        </w:rPr>
+        <w:t>not</w:t>
+      </w:r>
+      <w:r>
+        <w:t xml:space="preserve"> an echo: the engine took the Flood-to-2040 interval, snapped it to the moon’s 19-gear, and produced a date the inputs did not contain — and that date carries a real partial solar eclipse. This single row is the project’s thesis in miniature: the grammar proposes, the chronology disposes.</w:t>
+      </w:r>
+    </w:p>
+    <w:p>
+      <w:pPr>
+        <w:spacing w:after="120"/>
+      </w:pPr>
+      <w:r>
+        <w:t>In the Convergence section this date joins three other operations inside the ±30-day window around May 2040 — the strength-4 agreement that the test harness asserts on every run.</w:t>
       </w:r>
     </w:p>
     <w:p>
@@ -8186,10 +10242,96 @@
 <file path=word/numbering.xml><?xml version="1.0" encoding="utf-8"?>
 <w:numbering xmlns:wpc="http://schemas.microsoft.com/office/word/2010/wordprocessingCanvas" xmlns:cx="http://schemas.microsoft.com/office/drawing/2014/chartex" xmlns:cx1="http://schemas.microsoft.com/office/drawing/2015/9/8/chartex" xmlns:cx2="http://schemas.microsoft.com/office/drawing/2015/10/21/chartex" xmlns:cx3="http://schemas.microsoft.com/office/drawing/2016/5/9/chartex" xmlns:cx4="http://schemas.microsoft.com/office/drawing/2016/5/10/chartex" xmlns:cx5="http://schemas.microsoft.com/office/drawing/2016/5/11/chartex" xmlns:cx6="http://schemas.microsoft.com/office/drawing/2016/5/12/chartex" xmlns:cx7="http://schemas.microsoft.com/office/drawing/2016/5/13/chartex" xmlns:cx8="http://schemas.microsoft.com/office/drawing/2016/5/14/chartex" xmlns:mc="http://schemas.openxmlformats.org/markup-compatibility/2006" xmlns:aink="http://schemas.microsoft.com/office/drawing/2016/ink" xmlns:am3d="http://schemas.microsoft.com/office/drawing/2017/model3d" xmlns:o="urn:schemas-microsoft-com:office:office" xmlns:oel="http://schemas.microsoft.com/office/2019/extlst" xmlns:r="http://schemas.openxmlformats.org/officeDocument/2006/relationships" xmlns:m="http://schemas.openxmlformats.org/officeDocument/2006/math" xmlns:v="urn:schemas-microsoft-com:vml" xmlns:wp14="http://schemas.microsoft.com/office/word/2010/wordprocessingDrawing" xmlns:wp="http://schemas.openxmlformats.org/drawingml/2006/wordprocessingDrawing" xmlns:w10="urn:schemas-microsoft-com:office:word" xmlns:w="http://schemas.openxmlformats.org/wordprocessingml/2006/main" xmlns:w14="http://schemas.microsoft.com/office/word/2010/wordml" xmlns:w15="http://schemas.microsoft.com/office/word/2012/wordml" xmlns:w16cex="http://schemas.microsoft.com/office/word/2018/wordml/cex" xmlns:w16cid="http://schemas.microsoft.com/office/word/2016/wordml/cid" xmlns:w16="http://schemas.microsoft.com/office/word/2018/wordml" xmlns:w16du="http://schemas.microsoft.com/office/word/2023/wordml/word16du" xmlns:w16sdtdh="http://schemas.microsoft.com/office/word/2020/wordml/sdtdatahash" xmlns:w16sdtfl="http://schemas.microsoft.com/office/word/2024/wordml/sdtformatlock" xmlns:w16se="http://schemas.microsoft.com/office/word/2015/wordml/symex" xmlns:wpg="http://schemas.microsoft.com/office/word/2010/wordprocessingGroup" xmlns:wpi="http://schemas.microsoft.com/office/word/2010/wordprocessingInk" xmlns:wne="http://schemas.microsoft.com/office/word/2006/wordml" xmlns:wps="http://schemas.microsoft.com/office/word/2010/wordprocessingShape" mc:Ignorable="w14 w15 w16se w16cid w16 w16cex w16sdtdh w16sdtfl w16du wp14">
   <w:abstractNum w:abstractNumId="0" w15:restartNumberingAfterBreak="0">
-    <w:nsid w:val="0A325003"/>
+    <w:nsid w:val="372D66E5"/>
     <w:multiLevelType w:val="hybridMultilevel"/>
-    <w:tmpl w:val="90628DAE"/>
-    <w:lvl w:ilvl="0" w:tplc="D2689C58">
+    <w:tmpl w:val="77A4553C"/>
+    <w:lvl w:ilvl="0" w:tplc="68668070">
+      <w:start w:val="1"/>
+      <w:numFmt w:val="bullet"/>
+      <w:lvlText w:val="●"/>
+      <w:lvlJc w:val="left"/>
+      <w:pPr>
+        <w:ind w:left="720" w:hanging="360"/>
+      </w:pPr>
+    </w:lvl>
+    <w:lvl w:ilvl="1" w:tplc="DF8C7BF6">
+      <w:start w:val="1"/>
+      <w:numFmt w:val="bullet"/>
+      <w:lvlText w:val="○"/>
+      <w:lvlJc w:val="left"/>
+      <w:pPr>
+        <w:ind w:left="1440" w:hanging="360"/>
+      </w:pPr>
+    </w:lvl>
+    <w:lvl w:ilvl="2" w:tplc="F590604E">
+      <w:start w:val="1"/>
+      <w:numFmt w:val="bullet"/>
+      <w:lvlText w:val="■"/>
+      <w:lvlJc w:val="left"/>
+      <w:pPr>
+        <w:ind w:left="2160" w:hanging="360"/>
+      </w:pPr>
+    </w:lvl>
+    <w:lvl w:ilvl="3" w:tplc="13782AD2">
+      <w:start w:val="1"/>
+      <w:numFmt w:val="bullet"/>
+      <w:lvlText w:val="●"/>
+      <w:lvlJc w:val="left"/>
+      <w:pPr>
+        <w:ind w:left="2880" w:hanging="360"/>
+      </w:pPr>
+    </w:lvl>
+    <w:lvl w:ilvl="4" w:tplc="0E681BB0">
+      <w:start w:val="1"/>
+      <w:numFmt w:val="bullet"/>
+      <w:lvlText w:val="○"/>
+      <w:lvlJc w:val="left"/>
+      <w:pPr>
+        <w:ind w:left="3600" w:hanging="360"/>
+      </w:pPr>
+    </w:lvl>
+    <w:lvl w:ilvl="5" w:tplc="7B2A97FA">
+      <w:start w:val="1"/>
+      <w:numFmt w:val="bullet"/>
+      <w:lvlText w:val="■"/>
+      <w:lvlJc w:val="left"/>
+      <w:pPr>
+        <w:ind w:left="4320" w:hanging="360"/>
+      </w:pPr>
+    </w:lvl>
+    <w:lvl w:ilvl="6" w:tplc="E8D25114">
+      <w:start w:val="1"/>
+      <w:numFmt w:val="bullet"/>
+      <w:lvlText w:val="●"/>
+      <w:lvlJc w:val="left"/>
+      <w:pPr>
+        <w:ind w:left="5040" w:hanging="360"/>
+      </w:pPr>
+    </w:lvl>
+    <w:lvl w:ilvl="7" w:tplc="DFF4298A">
+      <w:start w:val="1"/>
+      <w:numFmt w:val="bullet"/>
+      <w:lvlText w:val="●"/>
+      <w:lvlJc w:val="left"/>
+      <w:pPr>
+        <w:ind w:left="5760" w:hanging="360"/>
+      </w:pPr>
+    </w:lvl>
+    <w:lvl w:ilvl="8" w:tplc="11184606">
+      <w:start w:val="1"/>
+      <w:numFmt w:val="bullet"/>
+      <w:lvlText w:val="●"/>
+      <w:lvlJc w:val="left"/>
+      <w:pPr>
+        <w:ind w:left="6480" w:hanging="360"/>
+      </w:pPr>
+    </w:lvl>
+  </w:abstractNum>
+  <w:abstractNum w:abstractNumId="1" w15:restartNumberingAfterBreak="0">
+    <w:nsid w:val="69B6423A"/>
+    <w:multiLevelType w:val="hybridMultilevel"/>
+    <w:tmpl w:val="CFAECC4E"/>
+    <w:lvl w:ilvl="0" w:tplc="6400C98C">
       <w:start w:val="1"/>
       <w:numFmt w:val="bullet"/>
       <w:lvlText w:val="•"/>
@@ -8198,141 +10340,55 @@
         <w:ind w:left="720" w:hanging="360"/>
       </w:pPr>
     </w:lvl>
-    <w:lvl w:ilvl="1" w:tplc="6CE86392">
+    <w:lvl w:ilvl="1" w:tplc="7F4E4546">
       <w:numFmt w:val="decimal"/>
       <w:lvlText w:val=""/>
       <w:lvlJc w:val="left"/>
     </w:lvl>
-    <w:lvl w:ilvl="2" w:tplc="43BE5C70">
+    <w:lvl w:ilvl="2" w:tplc="E1200756">
       <w:numFmt w:val="decimal"/>
       <w:lvlText w:val=""/>
       <w:lvlJc w:val="left"/>
     </w:lvl>
-    <w:lvl w:ilvl="3" w:tplc="9A24F6C2">
+    <w:lvl w:ilvl="3" w:tplc="BE2AC170">
       <w:numFmt w:val="decimal"/>
       <w:lvlText w:val=""/>
       <w:lvlJc w:val="left"/>
     </w:lvl>
-    <w:lvl w:ilvl="4" w:tplc="2B4ECA94">
+    <w:lvl w:ilvl="4" w:tplc="603412D4">
       <w:numFmt w:val="decimal"/>
       <w:lvlText w:val=""/>
       <w:lvlJc w:val="left"/>
     </w:lvl>
-    <w:lvl w:ilvl="5" w:tplc="4266B2E8">
+    <w:lvl w:ilvl="5" w:tplc="BADE8BAC">
       <w:numFmt w:val="decimal"/>
       <w:lvlText w:val=""/>
       <w:lvlJc w:val="left"/>
     </w:lvl>
-    <w:lvl w:ilvl="6" w:tplc="1D141204">
+    <w:lvl w:ilvl="6" w:tplc="E7BCD654">
       <w:numFmt w:val="decimal"/>
       <w:lvlText w:val=""/>
       <w:lvlJc w:val="left"/>
     </w:lvl>
-    <w:lvl w:ilvl="7" w:tplc="693ECE22">
+    <w:lvl w:ilvl="7" w:tplc="16F402F6">
       <w:numFmt w:val="decimal"/>
       <w:lvlText w:val=""/>
       <w:lvlJc w:val="left"/>
     </w:lvl>
-    <w:lvl w:ilvl="8" w:tplc="735037C6">
+    <w:lvl w:ilvl="8" w:tplc="D9B69EC0">
       <w:numFmt w:val="decimal"/>
       <w:lvlText w:val=""/>
       <w:lvlJc w:val="left"/>
     </w:lvl>
   </w:abstractNum>
-  <w:abstractNum w:abstractNumId="1" w15:restartNumberingAfterBreak="0">
-    <w:nsid w:val="367C79B5"/>
-    <w:multiLevelType w:val="hybridMultilevel"/>
-    <w:tmpl w:val="64F8F3E2"/>
-    <w:lvl w:ilvl="0" w:tplc="D532662E">
-      <w:start w:val="1"/>
-      <w:numFmt w:val="bullet"/>
-      <w:lvlText w:val="●"/>
-      <w:lvlJc w:val="left"/>
-      <w:pPr>
-        <w:ind w:left="720" w:hanging="360"/>
-      </w:pPr>
-    </w:lvl>
-    <w:lvl w:ilvl="1" w:tplc="4F4695A4">
-      <w:start w:val="1"/>
-      <w:numFmt w:val="bullet"/>
-      <w:lvlText w:val="○"/>
-      <w:lvlJc w:val="left"/>
-      <w:pPr>
-        <w:ind w:left="1440" w:hanging="360"/>
-      </w:pPr>
-    </w:lvl>
-    <w:lvl w:ilvl="2" w:tplc="3F4EFFB2">
-      <w:start w:val="1"/>
-      <w:numFmt w:val="bullet"/>
-      <w:lvlText w:val="■"/>
-      <w:lvlJc w:val="left"/>
-      <w:pPr>
-        <w:ind w:left="2160" w:hanging="360"/>
-      </w:pPr>
-    </w:lvl>
-    <w:lvl w:ilvl="3" w:tplc="0EC6443A">
-      <w:start w:val="1"/>
-      <w:numFmt w:val="bullet"/>
-      <w:lvlText w:val="●"/>
-      <w:lvlJc w:val="left"/>
-      <w:pPr>
-        <w:ind w:left="2880" w:hanging="360"/>
-      </w:pPr>
-    </w:lvl>
-    <w:lvl w:ilvl="4" w:tplc="FAA2DB92">
-      <w:start w:val="1"/>
-      <w:numFmt w:val="bullet"/>
-      <w:lvlText w:val="○"/>
-      <w:lvlJc w:val="left"/>
-      <w:pPr>
-        <w:ind w:left="3600" w:hanging="360"/>
-      </w:pPr>
-    </w:lvl>
-    <w:lvl w:ilvl="5" w:tplc="FD6CAB28">
-      <w:start w:val="1"/>
-      <w:numFmt w:val="bullet"/>
-      <w:lvlText w:val="■"/>
-      <w:lvlJc w:val="left"/>
-      <w:pPr>
-        <w:ind w:left="4320" w:hanging="360"/>
-      </w:pPr>
-    </w:lvl>
-    <w:lvl w:ilvl="6" w:tplc="9CEC9922">
-      <w:start w:val="1"/>
-      <w:numFmt w:val="bullet"/>
-      <w:lvlText w:val="●"/>
-      <w:lvlJc w:val="left"/>
-      <w:pPr>
-        <w:ind w:left="5040" w:hanging="360"/>
-      </w:pPr>
-    </w:lvl>
-    <w:lvl w:ilvl="7" w:tplc="46908F3E">
-      <w:start w:val="1"/>
-      <w:numFmt w:val="bullet"/>
-      <w:lvlText w:val="●"/>
-      <w:lvlJc w:val="left"/>
-      <w:pPr>
-        <w:ind w:left="5760" w:hanging="360"/>
-      </w:pPr>
-    </w:lvl>
-    <w:lvl w:ilvl="8" w:tplc="A8043EEA">
-      <w:start w:val="1"/>
-      <w:numFmt w:val="bullet"/>
-      <w:lvlText w:val="●"/>
-      <w:lvlJc w:val="left"/>
-      <w:pPr>
-        <w:ind w:left="6480" w:hanging="360"/>
-      </w:pPr>
-    </w:lvl>
-  </w:abstractNum>
-  <w:num w:numId="1" w16cid:durableId="470251315">
-    <w:abstractNumId w:val="1"/>
+  <w:num w:numId="1" w16cid:durableId="1238399966">
+    <w:abstractNumId w:val="0"/>
     <w:lvlOverride w:ilvl="0">
       <w:startOverride w:val="1"/>
     </w:lvlOverride>
   </w:num>
-  <w:num w:numId="2" w16cid:durableId="1829713763">
-    <w:abstractNumId w:val="0"/>
+  <w:num w:numId="2" w16cid:durableId="668486610">
+    <w:abstractNumId w:val="1"/>
     <w:lvlOverride w:ilvl="0">
       <w:startOverride w:val="1"/>
     </w:lvlOverride>
@@ -8950,7 +11006,7 @@
     <w:autoRedefine/>
     <w:uiPriority w:val="39"/>
     <w:unhideWhenUsed/>
-    <w:rsid w:val="00B667C4"/>
+    <w:rsid w:val="00104680"/>
     <w:pPr>
       <w:spacing w:after="100"/>
     </w:pPr>
@@ -8962,7 +11018,7 @@
     <w:autoRedefine/>
     <w:uiPriority w:val="39"/>
     <w:unhideWhenUsed/>
-    <w:rsid w:val="00B667C4"/>
+    <w:rsid w:val="00104680"/>
     <w:pPr>
       <w:spacing w:after="100"/>
       <w:ind w:left="210"/>

</xml_diff>